<commit_message>
White paper v1.2: propagate voice and dictionary edits
- Rewrite Summary problem-first: communication is the hardest part
- Cut Part I.1 to scale numbers only; rename 1.2 and 1.3
- Reframe five stories (статус готовности, two-version compare, 20h)
- Put "система освобождает, а не ограничивает" upfront in Part II
- Rename 2.3 "Один набор кирпичей — разные маршруты"
- Remove roleRows table in 3.1; add Capture One sync example
- Fix 3.2 owner framing: may be any role including client
- Expand 3.3 library vs vitrina; note технические кадры and образ future
- Soften 3.4 pre/during-shoot coverage to conditional
- Propagate бренд→клиент, фотограф/ретушёр→команда, depersonalize I→Maket
- Update TOC to match new section titles
- Fix Таск-трекер typo; rename Part VII "Куда Maket идёт дальше"

Co-Authored-By: Claude Opus 4.6 <noreply@anthropic.com>
</commit_message>
<xml_diff>
--- a/docs/external/Maket_CP_Whitepaper.docx
+++ b/docs/external/Maket_CP_Whitepaper.docx
@@ -76,7 +76,7 @@
           <w:sz w:val="26"/>
           <w:szCs w:val="26"/>
         </w:rPr>
-        <w:t xml:space="preserve">Maket CP не навязывает процесс — он показывает тот, что уже идёт. Фотографу, бренду и ретушёру.</w:t>
+        <w:t xml:space="preserve">Система не должна ограничивать команду. Она должна её освобождать.</w:t>
       </w:r>
     </w:p>
     <w:p>
@@ -243,7 +243,7 @@
           <w:sz w:val="20"/>
           <w:szCs w:val="20"/>
         </w:rPr>
-        <w:t xml:space="preserve">1.2. Анатомия одного проекта, как я её вижу изнутри</w:t>
+        <w:t xml:space="preserve">1.2. Анатомия одного проекта</w:t>
       </w:r>
     </w:p>
     <w:p>
@@ -260,7 +260,7 @@
           <w:sz w:val="20"/>
           <w:szCs w:val="20"/>
         </w:rPr>
-        <w:t xml:space="preserve">1.3. Пять историй, которые я слышу в каждом проекте</w:t>
+        <w:t xml:space="preserve">1.3. Пять историй, которые повторяются в каждом проекте</w:t>
       </w:r>
     </w:p>
     <w:p>
@@ -328,7 +328,7 @@
           <w:sz w:val="20"/>
           <w:szCs w:val="20"/>
         </w:rPr>
-        <w:t xml:space="preserve">2.3. Один маршрут для разных типов контента</w:t>
+        <w:t xml:space="preserve">2.3. Один набор кирпичей — разные маршруты</w:t>
       </w:r>
     </w:p>
     <w:p>
@@ -532,7 +532,7 @@
           <w:sz w:val="22"/>
           <w:szCs w:val="22"/>
         </w:rPr>
-        <w:t xml:space="preserve">Часть VII. Куда я веду Maket CP дальше</w:t>
+        <w:t xml:space="preserve">Часть VII. Куда Maket идёт дальше</w:t>
       </w:r>
     </w:p>
     <w:p>
@@ -590,64 +590,71 @@
           <w:sz w:val="22"/>
           <w:szCs w:val="22"/>
         </w:rPr>
-        <w:t xml:space="preserve">Меня зовут Маша Баринская, я десять лет снимаю коммерческие съёмки для fashion- и lifestyle-брендов. Maket CP — это инструмент, который я начала делать, потому что устала в каждом проекте искать ответ на один и тот же вопрос: «а на каком мы сейчас этапе?».</w:t>
-      </w:r>
-    </w:p>
-    <w:p>
-      <w:pPr>
-        <w:spacing w:after="120" w:line="300"/>
-        <w:jc w:val="left"/>
-      </w:pPr>
-      <w:r>
-        <w:rPr>
-          <w:rFonts w:ascii="Arial" w:cs="Arial" w:eastAsia="Arial" w:hAnsi="Arial"/>
-          <w:b w:val="false"/>
-          <w:bCs w:val="false"/>
-          <w:i w:val="false"/>
-          <w:iCs w:val="false"/>
-          <w:color w:val="1f1f1f"/>
-          <w:sz w:val="22"/>
-          <w:szCs w:val="22"/>
-        </w:rPr>
-        <w:t xml:space="preserve">Съёмка давно перестала быть самой сложной частью проекта. Камера, свет, Capture One, ретушь в Photoshop — с этим всё в порядке. А вот всё, что происходит между съёмкой и публикацией — отбор, согласования, итерации, ретушь, адаптации — живёт в мессенджерах, в папках «final_2», в голове у стилиста. И на каждом стыке что-то теряется.</w:t>
-      </w:r>
-    </w:p>
-    <w:p>
-      <w:pPr>
-        <w:spacing w:after="120" w:line="300"/>
-        <w:jc w:val="left"/>
-      </w:pPr>
-      <w:r>
-        <w:rPr>
-          <w:rFonts w:ascii="Arial" w:cs="Arial" w:eastAsia="Arial" w:hAnsi="Arial"/>
-          <w:b w:val="false"/>
-          <w:bCs w:val="false"/>
-          <w:i w:val="false"/>
-          <w:iCs w:val="false"/>
-          <w:color w:val="1f1f1f"/>
-          <w:sz w:val="22"/>
-          <w:szCs w:val="22"/>
-        </w:rPr>
-        <w:t xml:space="preserve">Maket CP не пытается заменить Capture One или Photoshop. И не пытается быть ещё одним таск-трекером, где нужно вручную двигать карточки. Я сделала его по обратному принципу: он показывает то, что уже произошло. Фото снято — видно. Клиент его одобрил — записано. Партия ушла в ретушь — видно и фотографу, и ретушёру, и бренду.</w:t>
-      </w:r>
-    </w:p>
-    <w:p>
-      <w:pPr>
-        <w:spacing w:after="120" w:line="300"/>
-        <w:jc w:val="left"/>
-      </w:pPr>
-      <w:r>
-        <w:rPr>
-          <w:rFonts w:ascii="Arial" w:cs="Arial" w:eastAsia="Arial" w:hAnsi="Arial"/>
-          <w:b w:val="false"/>
-          <w:bCs w:val="false"/>
-          <w:i w:val="false"/>
-          <w:iCs w:val="false"/>
-          <w:color w:val="1f1f1f"/>
-          <w:sz w:val="22"/>
-          <w:szCs w:val="22"/>
-        </w:rPr>
-        <w:t xml:space="preserve">Что получает бренд, который работает с фотографом через Maket CP:</w:t>
+        <w:t xml:space="preserve">Самое сложное в коммерческой съёмке сегодня — не свет, не камера, не ретушь. Самое сложное и самое проблемное — коммуникация. То, что происходит в постпродакшне и ещё на этапе брифа. На каждом переходе между этапами что-то теряется: какая версия финальная, чей это был комментарий, что именно просили переделать. И это не про то, что кто-то плохо работает. Это про то, что сам процесс — невидимый.</w:t>
+      </w:r>
+    </w:p>
+    <w:p>
+      <w:pPr>
+        <w:spacing w:after="120" w:line="300"/>
+        <w:jc w:val="left"/>
+      </w:pPr>
+      <w:r>
+        <w:rPr>
+          <w:rFonts w:ascii="Arial" w:cs="Arial" w:eastAsia="Arial" w:hAnsi="Arial"/>
+          <w:b w:val="false"/>
+          <w:bCs w:val="false"/>
+          <w:i w:val="false"/>
+          <w:iCs w:val="false"/>
+          <w:color w:val="1f1f1f"/>
+          <w:sz w:val="22"/>
+          <w:szCs w:val="22"/>
+        </w:rPr>
+        <w:t xml:space="preserve">Maket CP закрывает этот невидимый слой. Не пытается быть таск-трекером, в котором вручную двигают карточки. Не пытается быть библиотекой готовых ассетов. И уж точно не пытается заменить Capture One или Photoshop. Maket делает другое: фиксирует то, что уже происходит в проекте, и делает это видимым для всех, кто в нём участвует.</w:t>
+      </w:r>
+    </w:p>
+    <w:p>
+      <w:pPr>
+        <w:spacing w:after="120" w:line="300"/>
+        <w:jc w:val="left"/>
+      </w:pPr>
+      <w:r>
+        <w:rPr>
+          <w:rFonts w:ascii="Arial" w:cs="Arial" w:eastAsia="Arial" w:hAnsi="Arial"/>
+          <w:b w:val="false"/>
+          <w:bCs w:val="false"/>
+          <w:i w:val="false"/>
+          <w:iCs w:val="false"/>
+          <w:color w:val="1f1f1f"/>
+          <w:sz w:val="22"/>
+          <w:szCs w:val="22"/>
+        </w:rPr>
+        <w:t xml:space="preserve">В основе — принцип парадоксальных изменений: чтобы что-то изменилось, его сначала надо увидеть таким, какое оно есть. Съёмочные проекты устроены именно так, как устроены, не потому что команды работают плохо — а потому что у процесса нет видимой формы. Над невидимым процессом невозможно работать. Maket даёт ему форму. И команда сама решает, что в этой форме хочет улучшить.</w:t>
+      </w:r>
+    </w:p>
+    <w:p>
+      <w:pPr>
+        <w:spacing w:after="120" w:line="300"/>
+        <w:jc w:val="left"/>
+      </w:pPr>
+      <w:r>
+        <w:rPr>
+          <w:rFonts w:ascii="Arial" w:cs="Arial" w:eastAsia="Arial" w:hAnsi="Arial"/>
+          <w:b/>
+          <w:bCs/>
+          <w:color w:val="1f1f1f"/>
+          <w:sz w:val="22"/>
+          <w:szCs w:val="22"/>
+        </w:rPr>
+        <w:t xml:space="preserve">Что получает команда </w:t>
+      </w:r>
+      <w:r>
+        <w:rPr>
+          <w:rFonts w:ascii="Arial" w:cs="Arial" w:eastAsia="Arial" w:hAnsi="Arial"/>
+          <w:color w:val="1f1f1f"/>
+          <w:sz w:val="22"/>
+          <w:szCs w:val="22"/>
+        </w:rPr>
+        <w:t xml:space="preserve">— фотограф, продюсер, стилист, ретушёр:</w:t>
       </w:r>
     </w:p>
     <w:p>
@@ -666,7 +673,7 @@
           <w:sz w:val="22"/>
           <w:szCs w:val="22"/>
         </w:rPr>
-        <w:t xml:space="preserve">Видно статус каждого кадра, без «напиши, что там с отбором».</w:t>
+        <w:t xml:space="preserve">Один объект, вокруг которого сходятся все решения. Не папка, не чат, не эксельный шот-лист. Контейнер, в который складываются кадры, комментарии и статусы.</w:t>
       </w:r>
     </w:p>
     <w:p>
@@ -685,7 +692,7 @@
           <w:sz w:val="22"/>
           <w:szCs w:val="22"/>
         </w:rPr>
-        <w:t xml:space="preserve">Готовые партии уходят дальше, не ждут последний спорный кадр.</w:t>
+        <w:t xml:space="preserve">Момент принятия решения становится видимым. Кто именно одобрил, когда, по какому кадру — записано. Это значит, что при недоступности одного участника другой может принять решение за него, и это не потеряется.</w:t>
       </w:r>
     </w:p>
     <w:p>
@@ -704,7 +711,33 @@
           <w:sz w:val="22"/>
           <w:szCs w:val="22"/>
         </w:rPr>
-        <w:t xml:space="preserve">История правок сохраняется. Когда через неделю встаёт вопрос «чья это была правка» — видно.</w:t>
+        <w:t xml:space="preserve">Интеграция с инструментами, а не замена им. Capture One остаётся Capture One. Превью и звёзды, которые ассистент проставил на площадке, сами уходят в Maket — и сразу видны клиенту.</w:t>
+      </w:r>
+    </w:p>
+    <w:p>
+      <w:pPr>
+        <w:spacing w:after="120" w:line="300"/>
+        <w:jc w:val="left"/>
+      </w:pPr>
+      <w:r>
+        <w:rPr>
+          <w:rFonts w:ascii="Arial" w:cs="Arial" w:eastAsia="Arial" w:hAnsi="Arial"/>
+          <w:b/>
+          <w:bCs/>
+          <w:color w:val="1f1f1f"/>
+          <w:sz w:val="22"/>
+          <w:szCs w:val="22"/>
+        </w:rPr>
+        <w:t xml:space="preserve">Что получает клиент </w:t>
+      </w:r>
+      <w:r>
+        <w:rPr>
+          <w:rFonts w:ascii="Arial" w:cs="Arial" w:eastAsia="Arial" w:hAnsi="Arial"/>
+          <w:color w:val="1f1f1f"/>
+          <w:sz w:val="22"/>
+          <w:szCs w:val="22"/>
+        </w:rPr>
+        <w:t xml:space="preserve">— конкретный заказчик или бренд-команда:</w:t>
       </w:r>
     </w:p>
     <w:p>
@@ -723,773 +756,7 @@
           <w:sz w:val="22"/>
           <w:szCs w:val="22"/>
         </w:rPr>
-        <w:t xml:space="preserve">Фото, которые дошли до ретуши и были отбракованы, не исчезают. В следующем сезоне это повод снимать меньше лишнего.</w:t>
-      </w:r>
-    </w:p>
-    <w:p>
-      <w:pPr>
-        <w:spacing w:after="120" w:line="300"/>
-        <w:jc w:val="left"/>
-      </w:pPr>
-      <w:r>
-        <w:rPr>
-          <w:rFonts w:ascii="Arial" w:cs="Arial" w:eastAsia="Arial" w:hAnsi="Arial"/>
-          <w:b w:val="false"/>
-          <w:bCs w:val="false"/>
-          <w:i w:val="false"/>
-          <w:iCs w:val="false"/>
-          <w:color w:val="1f1f1f"/>
-          <w:sz w:val="22"/>
-          <w:szCs w:val="22"/>
-        </w:rPr>
-        <w:t xml:space="preserve">В основе продукта — простая философия: чтобы процесс улучшить, его сначала надо увидеть. Не переделывать. Не навязывать поверх новый порядок. Увидеть тот, который уже есть — и сделать его видимым для всех, кто в нём участвует.</w:t>
-      </w:r>
-    </w:p>
-    <w:p>
-      <w:r>
-        <w:br w:type="page"/>
-      </w:r>
-    </w:p>
-    <w:p>
-      <w:pPr>
-        <w:pStyle w:val="Heading1"/>
-        <w:spacing w:after="240" w:before="360"/>
-      </w:pPr>
-      <w:r>
-        <w:rPr>
-          <w:rFonts w:ascii="Arial" w:cs="Arial" w:eastAsia="Arial" w:hAnsi="Arial"/>
-          <w:b/>
-          <w:bCs/>
-          <w:color w:val="111111"/>
-          <w:sz w:val="32"/>
-          <w:szCs w:val="32"/>
-        </w:rPr>
-        <w:t xml:space="preserve">Часть I. Что на самом деле происходит в проекте съёмки</w:t>
-      </w:r>
-    </w:p>
-    <w:p>
-      <w:pPr>
-        <w:pStyle w:val="Heading2"/>
-        <w:spacing w:after="180" w:before="280"/>
-      </w:pPr>
-      <w:r>
-        <w:rPr>
-          <w:rFonts w:ascii="Arial" w:cs="Arial" w:eastAsia="Arial" w:hAnsi="Arial"/>
-          <w:b/>
-          <w:bCs/>
-          <w:color w:val="111111"/>
-          <w:sz w:val="26"/>
-          <w:szCs w:val="26"/>
-        </w:rPr>
-        <w:t xml:space="preserve">1.1. Сколько кадров стоит за одним проектом</w:t>
-      </w:r>
-    </w:p>
-    <w:p>
-      <w:pPr>
-        <w:spacing w:after="120" w:line="300"/>
-        <w:jc w:val="left"/>
-      </w:pPr>
-      <w:r>
-        <w:rPr>
-          <w:rFonts w:ascii="Arial" w:cs="Arial" w:eastAsia="Arial" w:hAnsi="Arial"/>
-          <w:b w:val="false"/>
-          <w:bCs w:val="false"/>
-          <w:i w:val="false"/>
-          <w:iCs w:val="false"/>
-          <w:color w:val="1f1f1f"/>
-          <w:sz w:val="22"/>
-          <w:szCs w:val="22"/>
-        </w:rPr>
-        <w:t xml:space="preserve">E-commerce — это бизнес, в котором картинка решает всё. Покупатель не трогает платье, не примеряет ботинок, не нюхает крем. Он смотрит на фото — десятки на каждый артикул — и либо добавляет в корзину, либо листает дальше.</w:t>
-      </w:r>
-    </w:p>
-    <w:p>
-      <w:pPr>
-        <w:spacing w:after="120" w:line="300"/>
-        <w:jc w:val="left"/>
-      </w:pPr>
-      <w:r>
-        <w:rPr>
-          <w:rFonts w:ascii="Arial" w:cs="Arial" w:eastAsia="Arial" w:hAnsi="Arial"/>
-          <w:b w:val="false"/>
-          <w:bCs w:val="false"/>
-          <w:i w:val="false"/>
-          <w:iCs w:val="false"/>
-          <w:color w:val="1f1f1f"/>
-          <w:sz w:val="22"/>
-          <w:szCs w:val="22"/>
-        </w:rPr>
-        <w:t xml:space="preserve">Масштаб одного съёмочного проекта для бренда — это обычно 30–60 артикулов, от 6 до 12 кадров на каждый: предметка, на модели в студии, лайфстайл, детали. Плюс адаптации под каналы: квадрат для соцсетей, вертикаль для Reels, горизонталь для главной, 3:4 для маркетплейсов. На выходе — 400–700 финальных фото. За съёмку, которая идёт два-три дня, — 2000–3000 исходников.</w:t>
-      </w:r>
-    </w:p>
-    <w:p>
-      <w:pPr>
-        <w:spacing w:after="120" w:line="300"/>
-        <w:jc w:val="left"/>
-      </w:pPr>
-      <w:r>
-        <w:rPr>
-          <w:rFonts w:ascii="Arial" w:cs="Arial" w:eastAsia="Arial" w:hAnsi="Arial"/>
-          <w:b w:val="false"/>
-          <w:bCs w:val="false"/>
-          <w:i w:val="false"/>
-          <w:iCs w:val="false"/>
-          <w:color w:val="1f1f1f"/>
-          <w:sz w:val="22"/>
-          <w:szCs w:val="22"/>
-        </w:rPr>
-        <w:t xml:space="preserve">Каждый из этих кадров проходит примерно один и тот же путь. Снят — отобран командой — показан клиенту — согласован — ушёл в цветокоррекцию — прокомментирован на ретушь — отретуширован — согласован финально — адаптирован — опубликован. Этапов может быть больше или меньше: в одной команде восемь, в другой — четыре, часть шагов может идти скрыто от клиента. Maket CP подстраивается под процесс, а не навязывает свой. Важно другое: в каждой цепочке трое-четверо людей, у каждого свой Telegram, свой Lightroom, свои папки на диске. Любая точка — потенциальная потеря информации, и в 90% проектов она там и теряется.</w:t>
-      </w:r>
-    </w:p>
-    <w:p>
-      <w:pPr>
-        <w:pStyle w:val="Heading2"/>
-        <w:spacing w:after="180" w:before="280"/>
-      </w:pPr>
-      <w:r>
-        <w:rPr>
-          <w:rFonts w:ascii="Arial" w:cs="Arial" w:eastAsia="Arial" w:hAnsi="Arial"/>
-          <w:b/>
-          <w:bCs/>
-          <w:color w:val="111111"/>
-          <w:sz w:val="26"/>
-          <w:szCs w:val="26"/>
-        </w:rPr>
-        <w:t xml:space="preserve">1.2. Анатомия одного проекта, как я её вижу изнутри</w:t>
-      </w:r>
-    </w:p>
-    <w:p>
-      <w:pPr>
-        <w:spacing w:after="120" w:line="300"/>
-        <w:jc w:val="left"/>
-      </w:pPr>
-      <w:r>
-        <w:rPr>
-          <w:rFonts w:ascii="Arial" w:cs="Arial" w:eastAsia="Arial" w:hAnsi="Arial"/>
-          <w:b w:val="false"/>
-          <w:bCs w:val="false"/>
-          <w:i w:val="false"/>
-          <w:iCs w:val="false"/>
-          <w:color w:val="1f1f1f"/>
-          <w:sz w:val="22"/>
-          <w:szCs w:val="22"/>
-        </w:rPr>
-        <w:t xml:space="preserve">Когда ко мне приходит бренд на съёмку, дальше всё складывается примерно одинаково.</w:t>
-      </w:r>
-    </w:p>
-    <w:p>
-      <w:pPr>
-        <w:pStyle w:val="Heading3"/>
-        <w:spacing w:after="120" w:before="200"/>
-      </w:pPr>
-      <w:r>
-        <w:rPr>
-          <w:rFonts w:ascii="Arial" w:cs="Arial" w:eastAsia="Arial" w:hAnsi="Arial"/>
-          <w:b/>
-          <w:bCs/>
-          <w:color w:val="111111"/>
-          <w:sz w:val="22"/>
-          <w:szCs w:val="22"/>
-        </w:rPr>
-        <w:t xml:space="preserve">До съёмки</w:t>
-      </w:r>
-    </w:p>
-    <w:p>
-      <w:pPr>
-        <w:spacing w:after="120" w:line="300"/>
-        <w:jc w:val="left"/>
-      </w:pPr>
-      <w:r>
-        <w:rPr>
-          <w:rFonts w:ascii="Arial" w:cs="Arial" w:eastAsia="Arial" w:hAnsi="Arial"/>
-          <w:b w:val="false"/>
-          <w:bCs w:val="false"/>
-          <w:i w:val="false"/>
-          <w:iCs w:val="false"/>
-          <w:color w:val="1f1f1f"/>
-          <w:sz w:val="22"/>
-          <w:szCs w:val="22"/>
-        </w:rPr>
-        <w:t xml:space="preserve">Приходит бриф. В лучшем случае — документ с прописанными артикулами и референсами. Чаще — PDF-коллаж из Pinterest плюс голосовые в WhatsApp. Собираем команду, стилист подбирает образы, обсуждаем свет и локации. Составляем шот-лист в Excel или в Notion. На этом этапе уже есть шанс что-то упустить: «мы же договаривались снять этот образ сверху», «а где вообще кадр с часами?». Если бриф неподробный — а он неподробный почти всегда — часть решений просто дрейфует в голове.</w:t>
-      </w:r>
-    </w:p>
-    <w:p>
-      <w:pPr>
-        <w:pStyle w:val="Heading3"/>
-        <w:spacing w:after="120" w:before="200"/>
-      </w:pPr>
-      <w:r>
-        <w:rPr>
-          <w:rFonts w:ascii="Arial" w:cs="Arial" w:eastAsia="Arial" w:hAnsi="Arial"/>
-          <w:b/>
-          <w:bCs/>
-          <w:color w:val="111111"/>
-          <w:sz w:val="22"/>
-          <w:szCs w:val="22"/>
-        </w:rPr>
-        <w:t xml:space="preserve">На съёмке</w:t>
-      </w:r>
-    </w:p>
-    <w:p>
-      <w:pPr>
-        <w:spacing w:after="120" w:line="300"/>
-        <w:jc w:val="left"/>
-      </w:pPr>
-      <w:r>
-        <w:rPr>
-          <w:rFonts w:ascii="Arial" w:cs="Arial" w:eastAsia="Arial" w:hAnsi="Arial"/>
-          <w:b w:val="false"/>
-          <w:bCs w:val="false"/>
-          <w:i w:val="false"/>
-          <w:iCs w:val="false"/>
-          <w:color w:val="1f1f1f"/>
-          <w:sz w:val="22"/>
-          <w:szCs w:val="22"/>
-        </w:rPr>
-        <w:t xml:space="preserve">Студия, 2000 кадров за день. Ассистент на капче в Capture One отсекает явный брак — смазы, моргания, технический мусор. В перерывах стилист меняет аксессуары, фотограф перестраивает свет. Клиент, если он на площадке, смотрит в монитор и кивает. Если клиент удалённо — пишет в чат: «мне нравится третий вариант блузы, давайте ещё такой же, но с сумкой». Все эти решения ложатся на память команды.</w:t>
-      </w:r>
-    </w:p>
-    <w:p>
-      <w:pPr>
-        <w:pStyle w:val="Heading3"/>
-        <w:spacing w:after="120" w:before="200"/>
-      </w:pPr>
-      <w:r>
-        <w:rPr>
-          <w:rFonts w:ascii="Arial" w:cs="Arial" w:eastAsia="Arial" w:hAnsi="Arial"/>
-          <w:b/>
-          <w:bCs/>
-          <w:color w:val="111111"/>
-          <w:sz w:val="22"/>
-          <w:szCs w:val="22"/>
-        </w:rPr>
-        <w:t xml:space="preserve">После съёмки</w:t>
-      </w:r>
-    </w:p>
-    <w:p>
-      <w:pPr>
-        <w:spacing w:after="120" w:line="300"/>
-        <w:jc w:val="left"/>
-      </w:pPr>
-      <w:r>
-        <w:rPr>
-          <w:rFonts w:ascii="Arial" w:cs="Arial" w:eastAsia="Arial" w:hAnsi="Arial"/>
-          <w:b w:val="false"/>
-          <w:bCs w:val="false"/>
-          <w:i w:val="false"/>
-          <w:iCs w:val="false"/>
-          <w:color w:val="1f1f1f"/>
-          <w:sz w:val="22"/>
-          <w:szCs w:val="22"/>
-        </w:rPr>
-        <w:t xml:space="preserve">И вот тут начинается то, что съедает 70% моего времени. Из 2000 кадров я отбираю 300–500, собираю презентацию в Keynote или PDF, отправляю клиенту. Клиент открывает, смотрит, пишет: «да, но пятый кадр лучше шестого, и давайте заменим седьмой на третий». Я дорабатываю подборку, высылаю заново. Снова правки. Согласовали — партия уходит в цветокоррекцию. Потом комментарии на ретушь, сама ретушь, финальное согласование, адаптация под каналы.</w:t>
-      </w:r>
-    </w:p>
-    <w:p>
-      <w:pPr>
-        <w:spacing w:after="120" w:line="300"/>
-        <w:jc w:val="left"/>
-      </w:pPr>
-      <w:r>
-        <w:rPr>
-          <w:rFonts w:ascii="Arial" w:cs="Arial" w:eastAsia="Arial" w:hAnsi="Arial"/>
-          <w:b w:val="false"/>
-          <w:bCs w:val="false"/>
-          <w:i w:val="false"/>
-          <w:iCs w:val="false"/>
-          <w:color w:val="1f1f1f"/>
-          <w:sz w:val="22"/>
-          <w:szCs w:val="22"/>
-        </w:rPr>
-        <w:t xml:space="preserve">Проект длится от двух недель до двух месяцев. За это время фотография меняет адрес от трёх до пятнадцати раз (это с учётом итераций): мой диск, облако, почта, мессенджер, ретушёр, облако клиента, опять мессенджер, опять облако, публикация. И на каждом шаге сопроводительная информация — какой ракурс принят, какой комментарий, кто одобрил — едет либо устно, либо текстом в чате. Который потом никто не открывает.</w:t>
-      </w:r>
-    </w:p>
-    <w:p>
-      <w:pPr>
-        <w:pStyle w:val="Heading2"/>
-        <w:spacing w:after="180" w:before="280"/>
-      </w:pPr>
-      <w:r>
-        <w:rPr>
-          <w:rFonts w:ascii="Arial" w:cs="Arial" w:eastAsia="Arial" w:hAnsi="Arial"/>
-          <w:b/>
-          <w:bCs/>
-          <w:color w:val="111111"/>
-          <w:sz w:val="26"/>
-          <w:szCs w:val="26"/>
-        </w:rPr>
-        <w:t xml:space="preserve">1.3. Пять историй, которые я слышу в каждом проекте</w:t>
-      </w:r>
-    </w:p>
-    <w:p>
-      <w:pPr>
-        <w:spacing w:after="120" w:line="300"/>
-        <w:jc w:val="left"/>
-      </w:pPr>
-      <w:r>
-        <w:rPr>
-          <w:rFonts w:ascii="Arial" w:cs="Arial" w:eastAsia="Arial" w:hAnsi="Arial"/>
-          <w:b w:val="false"/>
-          <w:bCs w:val="false"/>
-          <w:i w:val="false"/>
-          <w:iCs w:val="false"/>
-          <w:color w:val="1f1f1f"/>
-          <w:sz w:val="22"/>
-          <w:szCs w:val="22"/>
-        </w:rPr>
-        <w:t xml:space="preserve">Рынок к этому привык. Плохая коммуникация в креативных проектах считается нормой, почти неизбежным злом: «ну так всегда, у всех». Поэтому проблемы не формулируются, а сразу обходятся — добавочным днём в график, дополнительной правкой, «пришли ещё раз финал, а то я потерял».</w:t>
-      </w:r>
-    </w:p>
-    <w:p>
-      <w:pPr>
-        <w:spacing w:after="120" w:line="300"/>
-        <w:jc w:val="left"/>
-      </w:pPr>
-      <w:r>
-        <w:rPr>
-          <w:rFonts w:ascii="Arial" w:cs="Arial" w:eastAsia="Arial" w:hAnsi="Arial"/>
-          <w:b w:val="false"/>
-          <w:bCs w:val="false"/>
-          <w:i w:val="false"/>
-          <w:iCs w:val="false"/>
-          <w:color w:val="1f1f1f"/>
-          <w:sz w:val="22"/>
-          <w:szCs w:val="22"/>
-        </w:rPr>
-        <w:t xml:space="preserve">Если собрать жалобы фотографов и брендов, с которыми я работала, получается пять повторяющихся ситуаций. Все стоят денег. Большинство — ещё и отношений.</w:t>
-      </w:r>
-    </w:p>
-    <w:p>
-      <w:pPr>
-        <w:pStyle w:val="Heading3"/>
-        <w:spacing w:after="120" w:before="200"/>
-      </w:pPr>
-      <w:r>
-        <w:rPr>
-          <w:rFonts w:ascii="Arial" w:cs="Arial" w:eastAsia="Arial" w:hAnsi="Arial"/>
-          <w:b/>
-          <w:bCs/>
-          <w:color w:val="111111"/>
-          <w:sz w:val="22"/>
-          <w:szCs w:val="22"/>
-        </w:rPr>
-        <w:t xml:space="preserve">«Напомни, мы сейчас где?»</w:t>
-      </w:r>
-    </w:p>
-    <w:p>
-      <w:pPr>
-        <w:spacing w:after="120" w:line="300"/>
-        <w:jc w:val="left"/>
-      </w:pPr>
-      <w:r>
-        <w:rPr>
-          <w:rFonts w:ascii="Arial" w:cs="Arial" w:eastAsia="Arial" w:hAnsi="Arial"/>
-          <w:b w:val="false"/>
-          <w:bCs w:val="false"/>
-          <w:i w:val="false"/>
-          <w:iCs w:val="false"/>
-          <w:color w:val="1f1f1f"/>
-          <w:sz w:val="22"/>
-          <w:szCs w:val="22"/>
-        </w:rPr>
-        <w:t xml:space="preserve">Процесс постпродакшна — нелинейный. Один кадр на ретуши, другой ждёт одобрения, третий вернулся на дополнительный ракурс. После двух-трёх итераций никто толком не помнит, какая версия одобрена, а какая вернулась на доработку. В чате 200 сообщений, в почте три треда, на диске папки «final», «final_2», «final_FINAL_v3». Когда через две недели клиент спрашивает «а почему здесь доплата за правку» — ответа нет. Потому что не осталось следа.</w:t>
-      </w:r>
-    </w:p>
-    <w:p>
-      <w:pPr>
-        <w:pStyle w:val="Heading3"/>
-        <w:spacing w:after="120" w:before="200"/>
-      </w:pPr>
-      <w:r>
-        <w:rPr>
-          <w:rFonts w:ascii="Arial" w:cs="Arial" w:eastAsia="Arial" w:hAnsi="Arial"/>
-          <w:b/>
-          <w:bCs/>
-          <w:color w:val="111111"/>
-          <w:sz w:val="22"/>
-          <w:szCs w:val="22"/>
-        </w:rPr>
-        <w:t xml:space="preserve">«Всё ждёт один кадр»</w:t>
-      </w:r>
-    </w:p>
-    <w:p>
-      <w:pPr>
-        <w:spacing w:after="120" w:line="300"/>
-        <w:jc w:val="left"/>
-      </w:pPr>
-      <w:r>
-        <w:rPr>
-          <w:rFonts w:ascii="Arial" w:cs="Arial" w:eastAsia="Arial" w:hAnsi="Arial"/>
-          <w:b w:val="false"/>
-          <w:bCs w:val="false"/>
-          <w:i w:val="false"/>
-          <w:iCs w:val="false"/>
-          <w:color w:val="1f1f1f"/>
-          <w:sz w:val="22"/>
-          <w:szCs w:val="22"/>
-        </w:rPr>
-        <w:t xml:space="preserve">Из 35 кадров съёмки готовы 30. Но отгрузить я не могу — нужно, чтобы клиент утвердил всё целиком. Иначе запутается. В итоге вся съёмка едет со скоростью пяти самых спорных кадров. Контент лежит готовый, но в оборот не идёт, пока не согласован последний. Это дополнительное время, которое никто не закладывал, но все платят.</w:t>
-      </w:r>
-    </w:p>
-    <w:p>
-      <w:pPr>
-        <w:pStyle w:val="Heading3"/>
-        <w:spacing w:after="120" w:before="200"/>
-      </w:pPr>
-      <w:r>
-        <w:rPr>
-          <w:rFonts w:ascii="Arial" w:cs="Arial" w:eastAsia="Arial" w:hAnsi="Arial"/>
-          <w:b/>
-          <w:bCs/>
-          <w:color w:val="111111"/>
-          <w:sz w:val="22"/>
-          <w:szCs w:val="22"/>
-        </w:rPr>
-        <w:t xml:space="preserve">«Это точно моя правка?»</w:t>
-      </w:r>
-    </w:p>
-    <w:p>
-      <w:pPr>
-        <w:spacing w:after="120" w:line="300"/>
-        <w:jc w:val="left"/>
-      </w:pPr>
-      <w:r>
-        <w:rPr>
-          <w:rFonts w:ascii="Arial" w:cs="Arial" w:eastAsia="Arial" w:hAnsi="Arial"/>
-          <w:b w:val="false"/>
-          <w:bCs w:val="false"/>
-          <w:i w:val="false"/>
-          <w:iCs w:val="false"/>
-          <w:color w:val="1f1f1f"/>
-          <w:sz w:val="22"/>
-          <w:szCs w:val="22"/>
-        </w:rPr>
-        <w:t xml:space="preserve">Третья итерация ретуши. Клиент вспоминает, что где-то уже просил «поменьше синего». Ретушёр утверждает, что уже уменьшил. Я сверяю версии вручную, и — да, уменьшил, просто клиент не помнит. Нет объективной записи, кто что сказал, когда и по какому кадру. Значит любая итерация превращается в «да ты не так понял».</w:t>
-      </w:r>
-    </w:p>
-    <w:p>
-      <w:pPr>
-        <w:pStyle w:val="Heading3"/>
-        <w:spacing w:after="120" w:before="200"/>
-      </w:pPr>
-      <w:r>
-        <w:rPr>
-          <w:rFonts w:ascii="Arial" w:cs="Arial" w:eastAsia="Arial" w:hAnsi="Arial"/>
-          <w:b/>
-          <w:bCs/>
-          <w:color w:val="111111"/>
-          <w:sz w:val="22"/>
-          <w:szCs w:val="22"/>
-        </w:rPr>
-        <w:t xml:space="preserve">«Двадцать часов на мусор»</w:t>
-      </w:r>
-    </w:p>
-    <w:p>
-      <w:pPr>
-        <w:spacing w:after="120" w:line="300"/>
-        <w:jc w:val="left"/>
-      </w:pPr>
-      <w:r>
-        <w:rPr>
-          <w:rFonts w:ascii="Arial" w:cs="Arial" w:eastAsia="Arial" w:hAnsi="Arial"/>
-          <w:b w:val="false"/>
-          <w:bCs w:val="false"/>
-          <w:i w:val="false"/>
-          <w:iCs w:val="false"/>
-          <w:color w:val="1f1f1f"/>
-          <w:sz w:val="22"/>
-          <w:szCs w:val="22"/>
-        </w:rPr>
-        <w:t xml:space="preserve">Берём 20 фотографий, которые дошли до ретуши и были отбракованы клиентом в финале. Это двадцать часов работы ретушёра. Деньги, которые кто-то — фотограф или бренд — вынужден списать. В следующем сезоне история повторится: эти же типы кадров снова снимут, снова отретушируют, снова выкинут. Потому что в прошлом проекте эта история нигде не сохранилась.</w:t>
-      </w:r>
-    </w:p>
-    <w:p>
-      <w:pPr>
-        <w:pStyle w:val="Heading3"/>
-        <w:spacing w:after="120" w:before="200"/>
-      </w:pPr>
-      <w:r>
-        <w:rPr>
-          <w:rFonts w:ascii="Arial" w:cs="Arial" w:eastAsia="Arial" w:hAnsi="Arial"/>
-          <w:b/>
-          <w:bCs/>
-          <w:color w:val="111111"/>
-          <w:sz w:val="22"/>
-          <w:szCs w:val="22"/>
-        </w:rPr>
-        <w:t xml:space="preserve">«А за что я плачу?»</w:t>
-      </w:r>
-    </w:p>
-    <w:p>
-      <w:pPr>
-        <w:spacing w:after="120" w:line="300"/>
-        <w:jc w:val="left"/>
-      </w:pPr>
-      <w:r>
-        <w:rPr>
-          <w:rFonts w:ascii="Arial" w:cs="Arial" w:eastAsia="Arial" w:hAnsi="Arial"/>
-          <w:b w:val="false"/>
-          <w:bCs w:val="false"/>
-          <w:i w:val="false"/>
-          <w:iCs w:val="false"/>
-          <w:color w:val="1f1f1f"/>
-          <w:sz w:val="22"/>
-          <w:szCs w:val="22"/>
-        </w:rPr>
-        <w:t xml:space="preserve">Клиент видит 300 финальных кадров. Он не видит ни 2000 исходников, ни 15 итераций ретуши, ни семи согласований под разные каналы. Поэтому любой разговор о стоимости проходит по шаблону «фото же всего тридцать, почему так дорого».</w:t>
-      </w:r>
-    </w:p>
-    <w:p>
-      <w:pPr>
-        <w:pBdr>
-          <w:bottom w:val="single" w:color="CCCCCC" w:sz="6" w:space="1"/>
-        </w:pBdr>
-        <w:spacing w:after="200" w:before="120"/>
-      </w:pPr>
-      <w:r>
-        <w:rPr>
-          <w:rFonts w:ascii="Arial" w:cs="Arial" w:eastAsia="Arial" w:hAnsi="Arial"/>
-          <w:sz w:val="2"/>
-          <w:szCs w:val="2"/>
-        </w:rPr>
-        <w:t xml:space="preserve"/>
-      </w:r>
-    </w:p>
-    <w:p>
-      <w:pPr>
-        <w:spacing w:after="120" w:line="300"/>
-        <w:jc w:val="left"/>
-      </w:pPr>
-      <w:r>
-        <w:rPr>
-          <w:rFonts w:ascii="Arial" w:cs="Arial" w:eastAsia="Arial" w:hAnsi="Arial"/>
-          <w:b w:val="false"/>
-          <w:bCs w:val="false"/>
-          <w:i w:val="false"/>
-          <w:iCs w:val="false"/>
-          <w:color w:val="1f1f1f"/>
-          <w:sz w:val="22"/>
-          <w:szCs w:val="22"/>
-        </w:rPr>
-        <w:t xml:space="preserve">Общее у всех этих историй одно: структура проекта существует — но живёт в головах участников. У продюсера — своя карта, у клиента — своя, у ретушёра — третья. Редко кто-то берёт и делает эту структуру видимой для всех одновременно. Чем больше команда, тем разительнее отличаются её роли и способы работы — единой модели нет и, по-моему, не должно быть. Именно поэтому Maket CP не навязывает процесс. Он делает его видимым.</w:t>
-      </w:r>
-    </w:p>
-    <w:p>
-      <w:r>
-        <w:br w:type="page"/>
-      </w:r>
-    </w:p>
-    <w:p>
-      <w:pPr>
-        <w:pStyle w:val="Heading1"/>
-        <w:spacing w:after="240" w:before="360"/>
-      </w:pPr>
-      <w:r>
-        <w:rPr>
-          <w:rFonts w:ascii="Arial" w:cs="Arial" w:eastAsia="Arial" w:hAnsi="Arial"/>
-          <w:b/>
-          <w:bCs/>
-          <w:color w:val="111111"/>
-          <w:sz w:val="32"/>
-          <w:szCs w:val="32"/>
-        </w:rPr>
-        <w:t xml:space="preserve">Часть II. Как я пришла к идее зеркала</w:t>
-      </w:r>
-    </w:p>
-    <w:p>
-      <w:pPr>
-        <w:spacing w:after="120" w:line="300"/>
-        <w:jc w:val="left"/>
-      </w:pPr>
-      <w:r>
-        <w:rPr>
-          <w:rFonts w:ascii="Arial" w:cs="Arial" w:eastAsia="Arial" w:hAnsi="Arial"/>
-          <w:b w:val="false"/>
-          <w:bCs w:val="false"/>
-          <w:i w:val="false"/>
-          <w:iCs w:val="false"/>
-          <w:color w:val="1f1f1f"/>
-          <w:sz w:val="22"/>
-          <w:szCs w:val="22"/>
-        </w:rPr>
-        <w:t xml:space="preserve">Когда ты в сотый раз открываешь проект и пытаешься вспомнить, какую версию кадра клиент одобрил, а какую просил поменять — в какой-то момент ты думаешь: «наверное, надо завести нормальный таск-трекер». Я пробовала. Заводила Trello, Asana, Notion с красиво расписанными статусами.</w:t>
-      </w:r>
-    </w:p>
-    <w:p>
-      <w:pPr>
-        <w:spacing w:after="120" w:line="300"/>
-        <w:jc w:val="left"/>
-      </w:pPr>
-      <w:r>
-        <w:rPr>
-          <w:rFonts w:ascii="Arial" w:cs="Arial" w:eastAsia="Arial" w:hAnsi="Arial"/>
-          <w:b w:val="false"/>
-          <w:bCs w:val="false"/>
-          <w:i w:val="false"/>
-          <w:iCs w:val="false"/>
-          <w:color w:val="1f1f1f"/>
-          <w:sz w:val="22"/>
-          <w:szCs w:val="22"/>
-        </w:rPr>
-        <w:t xml:space="preserve">Ничего из этого не прижилось. И не потому что я плохо вела. А потому что все эти инструменты требуют одного и того же: когда что-то произошло в реальной работе, ты должна пойти в систему и это отметить. Перенести карточку. Поставить галочку. Приложить новый файл. Это работа поверх работы. Мы с командой быстро возвращались в чат и на диск — потому что там всё происходит естественно.</w:t>
-      </w:r>
-    </w:p>
-    <w:p>
-      <w:pPr>
-        <w:spacing w:after="120" w:line="300"/>
-        <w:jc w:val="left"/>
-      </w:pPr>
-      <w:r>
-        <w:rPr>
-          <w:rFonts w:ascii="Arial" w:cs="Arial" w:eastAsia="Arial" w:hAnsi="Arial"/>
-          <w:b w:val="false"/>
-          <w:bCs w:val="false"/>
-          <w:i w:val="false"/>
-          <w:iCs w:val="false"/>
-          <w:color w:val="1f1f1f"/>
-          <w:sz w:val="22"/>
-          <w:szCs w:val="22"/>
-        </w:rPr>
-        <w:t xml:space="preserve">Тогда я поняла, в чём настоящая проблема. И сформулировать её помогла одна старая психотерапевтическая мысль — которая для продукта оказалась неожиданно точной.</w:t>
-      </w:r>
-    </w:p>
-    <w:p>
-      <w:pPr>
-        <w:pStyle w:val="Heading2"/>
-        <w:spacing w:after="180" w:before="280"/>
-      </w:pPr>
-      <w:r>
-        <w:rPr>
-          <w:rFonts w:ascii="Arial" w:cs="Arial" w:eastAsia="Arial" w:hAnsi="Arial"/>
-          <w:b/>
-          <w:bCs/>
-          <w:color w:val="111111"/>
-          <w:sz w:val="26"/>
-          <w:szCs w:val="26"/>
-        </w:rPr>
-        <w:t xml:space="preserve">2.1. Теория парадоксальных изменений</w:t>
-      </w:r>
-    </w:p>
-    <w:p>
-      <w:pPr>
-        <w:spacing w:after="120" w:line="300"/>
-        <w:jc w:val="left"/>
-      </w:pPr>
-      <w:r>
-        <w:rPr>
-          <w:rFonts w:ascii="Arial" w:cs="Arial" w:eastAsia="Arial" w:hAnsi="Arial"/>
-          <w:b w:val="false"/>
-          <w:bCs w:val="false"/>
-          <w:i w:val="false"/>
-          <w:iCs w:val="false"/>
-          <w:color w:val="1f1f1f"/>
-          <w:sz w:val="22"/>
-          <w:szCs w:val="22"/>
-        </w:rPr>
-        <w:t xml:space="preserve">В гештальт-психологии есть принцип: чтобы что-то изменилось, нужно сначала увидеть его таким, какое оно есть. Не переделывать, не бороться — увидеть и принять. Перемены происходят не тогда, когда человек заставляет себя стать другим, а когда он честно признаёт, что есть сейчас. Это и называется теорией парадоксальных изменений.</w:t>
-      </w:r>
-    </w:p>
-    <w:p>
-      <w:pPr>
-        <w:spacing w:after="120" w:line="300"/>
-        <w:jc w:val="left"/>
-      </w:pPr>
-      <w:r>
-        <w:rPr>
-          <w:rFonts w:ascii="Arial" w:cs="Arial" w:eastAsia="Arial" w:hAnsi="Arial"/>
-          <w:b w:val="false"/>
-          <w:bCs w:val="false"/>
-          <w:i w:val="false"/>
-          <w:iCs w:val="false"/>
-          <w:color w:val="1f1f1f"/>
-          <w:sz w:val="22"/>
-          <w:szCs w:val="22"/>
-        </w:rPr>
-        <w:t xml:space="preserve">Я думаю, это работает и для процессов. Съёмочный проект устроен именно так, как устроен, не потому что кто-то ленивый или непрофессиональный, а потому что он невидимый. Над невидимым процессом невозможно работать. Ты можешь поверх него повесить таск-трекер, но сам процесс останется в чатах и головах — и будет продолжать жить своей жизнью.</w:t>
-      </w:r>
-    </w:p>
-    <w:p>
-      <w:pPr>
-        <w:spacing w:after="120" w:line="300"/>
-        <w:jc w:val="left"/>
-      </w:pPr>
-      <w:r>
-        <w:rPr>
-          <w:rFonts w:ascii="Arial" w:cs="Arial" w:eastAsia="Arial" w:hAnsi="Arial"/>
-          <w:b w:val="false"/>
-          <w:bCs w:val="false"/>
-          <w:i w:val="false"/>
-          <w:iCs w:val="false"/>
-          <w:color w:val="1f1f1f"/>
-          <w:sz w:val="22"/>
-          <w:szCs w:val="22"/>
-        </w:rPr>
-        <w:t xml:space="preserve">Для меня это стало ключом. То, как команды сейчас ведут проекты, — не ошибка, которую надо чинить. Это выстроенный годами живой способ работы, который нельзя ломать системой. Его нужно поддержать и улучшить за счёт системы. Хорошая система не ограничивает. Она освобождает.</w:t>
-      </w:r>
-    </w:p>
-    <w:p>
-      <w:pPr>
-        <w:pBdr>
-          <w:left w:val="single" w:color="B33A3A" w:sz="24" w:space="12"/>
-        </w:pBdr>
-        <w:spacing w:after="180" w:before="180" w:line="320"/>
-        <w:ind w:left="400" w:right="400"/>
-      </w:pPr>
-      <w:r>
-        <w:rPr>
-          <w:rFonts w:ascii="Arial" w:cs="Arial" w:eastAsia="Arial" w:hAnsi="Arial"/>
-          <w:i/>
-          <w:iCs/>
-          <w:color w:val="1f1f1f"/>
-          <w:sz w:val="22"/>
-          <w:szCs w:val="22"/>
-        </w:rPr>
-        <w:t xml:space="preserve">«Система не должна навязывать, как работать. Она должна делать видимым то, что уже происходит.»</w:t>
-      </w:r>
-      <w:r>
-        <w:rPr>
-          <w:rFonts w:ascii="Arial" w:cs="Arial" w:eastAsia="Arial" w:hAnsi="Arial"/>
-          <w:color w:val="6a6a6a"/>
-          <w:sz w:val="20"/>
-          <w:szCs w:val="20"/>
-        </w:rPr>
-        <w:t xml:space="preserve">  — Рабочая формулировка Maket CP</w:t>
-      </w:r>
-    </w:p>
-    <w:p>
-      <w:pPr>
-        <w:pStyle w:val="Heading2"/>
-        <w:spacing w:after="180" w:before="280"/>
-      </w:pPr>
-      <w:r>
-        <w:rPr>
-          <w:rFonts w:ascii="Arial" w:cs="Arial" w:eastAsia="Arial" w:hAnsi="Arial"/>
-          <w:b/>
-          <w:bCs/>
-          <w:color w:val="111111"/>
-          <w:sz w:val="26"/>
-          <w:szCs w:val="26"/>
-        </w:rPr>
-        <w:t xml:space="preserve">2.2. Если не управлять, а показывать</w:t>
-      </w:r>
-    </w:p>
-    <w:p>
-      <w:pPr>
-        <w:spacing w:after="120" w:line="300"/>
-        <w:jc w:val="left"/>
-      </w:pPr>
-      <w:r>
-        <w:rPr>
-          <w:rFonts w:ascii="Arial" w:cs="Arial" w:eastAsia="Arial" w:hAnsi="Arial"/>
-          <w:b w:val="false"/>
-          <w:bCs w:val="false"/>
-          <w:i w:val="false"/>
-          <w:iCs w:val="false"/>
-          <w:color w:val="1f1f1f"/>
-          <w:sz w:val="22"/>
-          <w:szCs w:val="22"/>
-        </w:rPr>
-        <w:t xml:space="preserve">Отсюда главный принцип Maket CP. Я не создаю новое — я отражаю то, что уже есть. Это и есть принцип зеркала.</w:t>
+        <w:t xml:space="preserve">Вместо 2000 файлов в папке — готовая витрина. Кадры разложены по контейнерам, с фильтрами: что отобрано в карточку товара, что в соцсети, что в публикацию, что как технический кадр.</w:t>
       </w:r>
     </w:p>
     <w:p>
@@ -1504,22 +771,11 @@
       <w:r>
         <w:rPr>
           <w:rFonts w:ascii="Arial" w:cs="Arial" w:eastAsia="Arial" w:hAnsi="Arial"/>
-          <w:b/>
-          <w:bCs/>
-          <w:color w:val="1f1f1f"/>
-          <w:sz w:val="22"/>
-          <w:szCs w:val="22"/>
-        </w:rPr>
-        <w:t xml:space="preserve">Фотографии уже лежат в папках. </w:t>
-      </w:r>
-      <w:r>
-        <w:rPr>
-          <w:rFonts w:ascii="Arial" w:cs="Arial" w:eastAsia="Arial" w:hAnsi="Arial"/>
-          <w:color w:val="1f1f1f"/>
-          <w:sz w:val="22"/>
-          <w:szCs w:val="22"/>
-        </w:rPr>
-        <w:t xml:space="preserve">Я показываю их как карточки. Тебе не нужно их «заносить».</w:t>
+          <w:color w:val="1f1f1f"/>
+          <w:sz w:val="22"/>
+          <w:szCs w:val="22"/>
+        </w:rPr>
+        <w:t xml:space="preserve">Согласование в одну ссылку. Без регистрации, с телефона, из такси. Вернулся — видит ровно то состояние, на котором остановился.</w:t>
       </w:r>
     </w:p>
     <w:p>
@@ -1534,22 +790,612 @@
       <w:r>
         <w:rPr>
           <w:rFonts w:ascii="Arial" w:cs="Arial" w:eastAsia="Arial" w:hAnsi="Arial"/>
-          <w:b/>
-          <w:bCs/>
-          <w:color w:val="1f1f1f"/>
-          <w:sz w:val="22"/>
-          <w:szCs w:val="22"/>
-        </w:rPr>
-        <w:t xml:space="preserve">Отбор уже произошёл в голове стилиста. </w:t>
-      </w:r>
-      <w:r>
-        <w:rPr>
-          <w:rFonts w:ascii="Arial" w:cs="Arial" w:eastAsia="Arial" w:hAnsi="Arial"/>
-          <w:color w:val="1f1f1f"/>
-          <w:sz w:val="22"/>
-          <w:szCs w:val="22"/>
-        </w:rPr>
-        <w:t xml:space="preserve">Я даю разложить его в структуру за один клик.</w:t>
+          <w:color w:val="1f1f1f"/>
+          <w:sz w:val="22"/>
+          <w:szCs w:val="22"/>
+        </w:rPr>
+        <w:t xml:space="preserve">История проекта, которая не исчезает. Кто что сказал, когда и по какому кадру. Какие кадры дошли до ретуши и были отбракованы — тоже сохраняется. В следующем сезоне это повод снимать меньше лишнего.</w:t>
+      </w:r>
+    </w:p>
+    <w:p>
+      <w:pPr>
+        <w:spacing w:after="120" w:line="300"/>
+        <w:jc w:val="left"/>
+      </w:pPr>
+      <w:r>
+        <w:rPr>
+          <w:rFonts w:ascii="Arial" w:cs="Arial" w:eastAsia="Arial" w:hAnsi="Arial"/>
+          <w:b w:val="false"/>
+          <w:bCs w:val="false"/>
+          <w:i w:val="false"/>
+          <w:iCs w:val="false"/>
+          <w:color w:val="1f1f1f"/>
+          <w:sz w:val="22"/>
+          <w:szCs w:val="22"/>
+        </w:rPr>
+        <w:t xml:space="preserve">Клиент работает не с фотографом — клиент работает с командой. Maket CP делает эту команду видимой как единое целое, с прозрачными зонами ответственности и прозрачной историей решений.</w:t>
+      </w:r>
+    </w:p>
+    <w:p>
+      <w:r>
+        <w:br w:type="page"/>
+      </w:r>
+    </w:p>
+    <w:p>
+      <w:pPr>
+        <w:pStyle w:val="Heading1"/>
+        <w:spacing w:after="240" w:before="360"/>
+      </w:pPr>
+      <w:r>
+        <w:rPr>
+          <w:rFonts w:ascii="Arial" w:cs="Arial" w:eastAsia="Arial" w:hAnsi="Arial"/>
+          <w:b/>
+          <w:bCs/>
+          <w:color w:val="111111"/>
+          <w:sz w:val="32"/>
+          <w:szCs w:val="32"/>
+        </w:rPr>
+        <w:t xml:space="preserve">Часть I. Что на самом деле происходит в проекте съёмки</w:t>
+      </w:r>
+    </w:p>
+    <w:p>
+      <w:pPr>
+        <w:pStyle w:val="Heading2"/>
+        <w:spacing w:after="180" w:before="280"/>
+      </w:pPr>
+      <w:r>
+        <w:rPr>
+          <w:rFonts w:ascii="Arial" w:cs="Arial" w:eastAsia="Arial" w:hAnsi="Arial"/>
+          <w:b/>
+          <w:bCs/>
+          <w:color w:val="111111"/>
+          <w:sz w:val="26"/>
+          <w:szCs w:val="26"/>
+        </w:rPr>
+        <w:t xml:space="preserve">1.1. Сколько кадров стоит за одним проектом</w:t>
+      </w:r>
+    </w:p>
+    <w:p>
+      <w:pPr>
+        <w:spacing w:after="120" w:line="300"/>
+        <w:jc w:val="left"/>
+      </w:pPr>
+      <w:r>
+        <w:rPr>
+          <w:rFonts w:ascii="Arial" w:cs="Arial" w:eastAsia="Arial" w:hAnsi="Arial"/>
+          <w:b w:val="false"/>
+          <w:bCs w:val="false"/>
+          <w:i w:val="false"/>
+          <w:iCs w:val="false"/>
+          <w:color w:val="1f1f1f"/>
+          <w:sz w:val="22"/>
+          <w:szCs w:val="22"/>
+        </w:rPr>
+        <w:t xml:space="preserve">Один проект — это чаще всего один съёмочный день, иногда два или три. В среднем 30–60 артикулов, по 6–10 кадров на каждый, плюс 2–3 формата адаптации под каналы. На выходе примерно 3000 исходников, из которых после отбора остаётся 200–600 кадров. Это и есть масштаб, который потом проходит весь постпродакшн.</w:t>
+      </w:r>
+    </w:p>
+    <w:p>
+      <w:pPr>
+        <w:pStyle w:val="Heading2"/>
+        <w:spacing w:after="180" w:before="280"/>
+      </w:pPr>
+      <w:r>
+        <w:rPr>
+          <w:rFonts w:ascii="Arial" w:cs="Arial" w:eastAsia="Arial" w:hAnsi="Arial"/>
+          <w:b/>
+          <w:bCs/>
+          <w:color w:val="111111"/>
+          <w:sz w:val="26"/>
+          <w:szCs w:val="26"/>
+        </w:rPr>
+        <w:t xml:space="preserve">1.2. Анатомия одного проекта</w:t>
+      </w:r>
+    </w:p>
+    <w:p>
+      <w:pPr>
+        <w:spacing w:after="120" w:line="300"/>
+        <w:jc w:val="left"/>
+      </w:pPr>
+      <w:r>
+        <w:rPr>
+          <w:rFonts w:ascii="Arial" w:cs="Arial" w:eastAsia="Arial" w:hAnsi="Arial"/>
+          <w:b w:val="false"/>
+          <w:bCs w:val="false"/>
+          <w:i w:val="false"/>
+          <w:iCs w:val="false"/>
+          <w:color w:val="1f1f1f"/>
+          <w:sz w:val="22"/>
+          <w:szCs w:val="22"/>
+        </w:rPr>
+        <w:t xml:space="preserve">У любого коммерческого проекта есть одна общая черта: бриф не бывает точным. Как бы подробно его ни расписали, бо́льшая часть решений всё равно остаётся в голове — у клиента, у продюсера, у стилиста. Часть дрейфует устно, часть уточняется в день съёмки, часть догоняется в чате уже в постпродакшне. Это не ошибка команды — это просто реальность того, как выглядит живая креативная работа.</w:t>
+      </w:r>
+    </w:p>
+    <w:p>
+      <w:pPr>
+        <w:spacing w:after="120" w:line="300"/>
+        <w:jc w:val="left"/>
+      </w:pPr>
+      <w:r>
+        <w:rPr>
+          <w:rFonts w:ascii="Arial" w:cs="Arial" w:eastAsia="Arial" w:hAnsi="Arial"/>
+          <w:b w:val="false"/>
+          <w:bCs w:val="false"/>
+          <w:i w:val="false"/>
+          <w:iCs w:val="false"/>
+          <w:color w:val="1f1f1f"/>
+          <w:sz w:val="22"/>
+          <w:szCs w:val="22"/>
+        </w:rPr>
+        <w:t xml:space="preserve">Именно поэтому центр тяжести проекта — не сама съёмка, а то, что происходит после. Из ~3000 исходников команда отбирает несколько сотен, показывает клиенту, правит, отправляет на ретушь, собирает комментарии, согласовывает, адаптирует. Каждый кадр на этом пути проходит примерно одни и те же шаги: отбор командой, отбор клиентом, цветокоррекция, комментарии на ретушь, ретушь, финальное согласование, адаптация под каналы. Конкретные шаги и их порядок в каждой команде свои, и это нормально — Maket CP работает с этой вариативностью, а не заставляет её под одну схему.</w:t>
+      </w:r>
+    </w:p>
+    <w:p>
+      <w:pPr>
+        <w:spacing w:after="120" w:line="300"/>
+        <w:jc w:val="left"/>
+      </w:pPr>
+      <w:r>
+        <w:rPr>
+          <w:rFonts w:ascii="Arial" w:cs="Arial" w:eastAsia="Arial" w:hAnsi="Arial"/>
+          <w:b w:val="false"/>
+          <w:bCs w:val="false"/>
+          <w:i w:val="false"/>
+          <w:iCs w:val="false"/>
+          <w:color w:val="1f1f1f"/>
+          <w:sz w:val="22"/>
+          <w:szCs w:val="22"/>
+        </w:rPr>
+        <w:t xml:space="preserve">Проблема в другом. В каждой такой цепочке — трое-четверо людей, у каждого свой мессенджер, своё облако, свои папки. Сопроводительная информация (какой ракурс принят, чей это комментарий, кто одобрил) едет устно или текстом в чате, который потом никто не открывает. Любая точка в цепочке — потенциальная потеря смысла. И проект длится не дни, а недели, иногда месяцы, за которые один и тот же кадр меняет адрес по несколько раз.</w:t>
+      </w:r>
+    </w:p>
+    <w:p>
+      <w:pPr>
+        <w:pStyle w:val="Heading2"/>
+        <w:spacing w:after="180" w:before="280"/>
+      </w:pPr>
+      <w:r>
+        <w:rPr>
+          <w:rFonts w:ascii="Arial" w:cs="Arial" w:eastAsia="Arial" w:hAnsi="Arial"/>
+          <w:b/>
+          <w:bCs/>
+          <w:color w:val="111111"/>
+          <w:sz w:val="26"/>
+          <w:szCs w:val="26"/>
+        </w:rPr>
+        <w:t xml:space="preserve">1.3. Пять историй, которые повторяются в каждом проекте</w:t>
+      </w:r>
+    </w:p>
+    <w:p>
+      <w:pPr>
+        <w:spacing w:after="120" w:line="300"/>
+        <w:jc w:val="left"/>
+      </w:pPr>
+      <w:r>
+        <w:rPr>
+          <w:rFonts w:ascii="Arial" w:cs="Arial" w:eastAsia="Arial" w:hAnsi="Arial"/>
+          <w:b w:val="false"/>
+          <w:bCs w:val="false"/>
+          <w:i w:val="false"/>
+          <w:iCs w:val="false"/>
+          <w:color w:val="1f1f1f"/>
+          <w:sz w:val="22"/>
+          <w:szCs w:val="22"/>
+        </w:rPr>
+        <w:t xml:space="preserve">Рынок привык: плохая коммуникация в креативных проектах считается нормой. «Ну так всегда, у всех». Поэтому проблемы не формулируются, а сразу обходятся — добавочным днём в график, дополнительной правкой, «пришли ещё раз финал, а то я потерял». Если собрать повторяющиеся ситуации, получается пять. И все они стоят денег.</w:t>
+      </w:r>
+    </w:p>
+    <w:p>
+      <w:pPr>
+        <w:pStyle w:val="Heading3"/>
+        <w:spacing w:after="120" w:before="200"/>
+      </w:pPr>
+      <w:r>
+        <w:rPr>
+          <w:rFonts w:ascii="Arial" w:cs="Arial" w:eastAsia="Arial" w:hAnsi="Arial"/>
+          <w:b/>
+          <w:bCs/>
+          <w:color w:val="111111"/>
+          <w:sz w:val="22"/>
+          <w:szCs w:val="22"/>
+        </w:rPr>
+        <w:t xml:space="preserve">«А какой сейчас статус готовности?»</w:t>
+      </w:r>
+    </w:p>
+    <w:p>
+      <w:pPr>
+        <w:spacing w:after="120" w:line="300"/>
+        <w:jc w:val="left"/>
+      </w:pPr>
+      <w:r>
+        <w:rPr>
+          <w:rFonts w:ascii="Arial" w:cs="Arial" w:eastAsia="Arial" w:hAnsi="Arial"/>
+          <w:b w:val="false"/>
+          <w:bCs w:val="false"/>
+          <w:i w:val="false"/>
+          <w:iCs w:val="false"/>
+          <w:color w:val="1f1f1f"/>
+          <w:sz w:val="22"/>
+          <w:szCs w:val="22"/>
+        </w:rPr>
+        <w:t xml:space="preserve">Это самый простой вопрос, на который почти никогда нет простого ответа. Статус чего — двух кадров, которые докинули вчера? Одной партии? Проекта целиком? Готовности к публикации или готовности к показу клиенту? Процесс постпродакшна нелинейный: один кадр на ретуши, другой ждёт одобрения, третий вернулся на дополнительный ракурс. Чтобы в любой момент отвечать на «какой статус», кто-то в команде должен держать всю эту картину в голове — и тратить на это ощутимую часть своего дня. Это не про то, что кто-то плохо помнит. Это про то, что усилие на удержание видимости никто не оплачивает. Maket CP снимает это усилие: статус по кадру, по карточке, по проекту виден сразу, и ответ «а что сейчас готово» даёт сама система.</w:t>
+      </w:r>
+    </w:p>
+    <w:p>
+      <w:pPr>
+        <w:pStyle w:val="Heading3"/>
+        <w:spacing w:after="120" w:before="200"/>
+      </w:pPr>
+      <w:r>
+        <w:rPr>
+          <w:rFonts w:ascii="Arial" w:cs="Arial" w:eastAsia="Arial" w:hAnsi="Arial"/>
+          <w:b/>
+          <w:bCs/>
+          <w:color w:val="111111"/>
+          <w:sz w:val="22"/>
+          <w:szCs w:val="22"/>
+        </w:rPr>
+        <w:t xml:space="preserve">«Это моя правка или нет?»</w:t>
+      </w:r>
+    </w:p>
+    <w:p>
+      <w:pPr>
+        <w:spacing w:after="120" w:line="300"/>
+        <w:jc w:val="left"/>
+      </w:pPr>
+      <w:r>
+        <w:rPr>
+          <w:rFonts w:ascii="Arial" w:cs="Arial" w:eastAsia="Arial" w:hAnsi="Arial"/>
+          <w:b w:val="false"/>
+          <w:bCs w:val="false"/>
+          <w:i w:val="false"/>
+          <w:iCs w:val="false"/>
+          <w:color w:val="1f1f1f"/>
+          <w:sz w:val="22"/>
+          <w:szCs w:val="22"/>
+        </w:rPr>
+        <w:t xml:space="preserve">Третья итерация ретуши. Клиент вспоминает, что где-то уже просил «поменьше синего». Ретушёр говорит, что уже уменьшил. Сверка версий — вручную: открыть две, сравнить глазами, попробовать вспомнить, что было до. Объективной записи нет, поэтому любая итерация превращается в «да ты не так понял».</w:t>
+      </w:r>
+    </w:p>
+    <w:p>
+      <w:pPr>
+        <w:spacing w:after="120" w:line="300"/>
+        <w:jc w:val="left"/>
+      </w:pPr>
+      <w:r>
+        <w:rPr>
+          <w:rFonts w:ascii="Arial" w:cs="Arial" w:eastAsia="Arial" w:hAnsi="Arial"/>
+          <w:b w:val="false"/>
+          <w:bCs w:val="false"/>
+          <w:i w:val="false"/>
+          <w:iCs w:val="false"/>
+          <w:color w:val="1f1f1f"/>
+          <w:sz w:val="22"/>
+          <w:szCs w:val="22"/>
+        </w:rPr>
+        <w:t xml:space="preserve">В Maket в ближайшее время появится функция, которая показывает две версии рядом — предыдущую и текущую — с визуальной разницей и ссылкой на комментарий, из которого правка родилась. Не «кто прав», а «вот точно что изменилось, и вот из-за какого комментария». Спор превращается в факт.</w:t>
+      </w:r>
+    </w:p>
+    <w:p>
+      <w:pPr>
+        <w:pStyle w:val="Heading3"/>
+        <w:spacing w:after="120" w:before="200"/>
+      </w:pPr>
+      <w:r>
+        <w:rPr>
+          <w:rFonts w:ascii="Arial" w:cs="Arial" w:eastAsia="Arial" w:hAnsi="Arial"/>
+          <w:b/>
+          <w:bCs/>
+          <w:color w:val="111111"/>
+          <w:sz w:val="22"/>
+          <w:szCs w:val="22"/>
+        </w:rPr>
+        <w:t xml:space="preserve">«Всё ждёт один кадр»</w:t>
+      </w:r>
+    </w:p>
+    <w:p>
+      <w:pPr>
+        <w:spacing w:after="120" w:line="300"/>
+        <w:jc w:val="left"/>
+      </w:pPr>
+      <w:r>
+        <w:rPr>
+          <w:rFonts w:ascii="Arial" w:cs="Arial" w:eastAsia="Arial" w:hAnsi="Arial"/>
+          <w:b w:val="false"/>
+          <w:bCs w:val="false"/>
+          <w:i w:val="false"/>
+          <w:iCs w:val="false"/>
+          <w:color w:val="1f1f1f"/>
+          <w:sz w:val="22"/>
+          <w:szCs w:val="22"/>
+        </w:rPr>
+        <w:t xml:space="preserve">Из 35 кадров съёмки готовы 30. Отгрузить всю партию нельзя — нужно, чтобы клиент утвердил целиком, иначе потеряется. В итоге вся съёмка едет со скоростью пяти самых спорных кадров. Контент лежит готовый, но в оборот не идёт. Maket CP решает это через частичное согласование: готовые кадры идут дальше, спорные остаются на доработке, и они не блокируют друг друга.</w:t>
+      </w:r>
+    </w:p>
+    <w:p>
+      <w:pPr>
+        <w:pStyle w:val="Heading3"/>
+        <w:spacing w:after="120" w:before="200"/>
+      </w:pPr>
+      <w:r>
+        <w:rPr>
+          <w:rFonts w:ascii="Arial" w:cs="Arial" w:eastAsia="Arial" w:hAnsi="Arial"/>
+          <w:b/>
+          <w:bCs/>
+          <w:color w:val="111111"/>
+          <w:sz w:val="22"/>
+          <w:szCs w:val="22"/>
+        </w:rPr>
+        <w:t xml:space="preserve">«Двадцать часов на мусор»</w:t>
+      </w:r>
+    </w:p>
+    <w:p>
+      <w:pPr>
+        <w:spacing w:after="120" w:line="300"/>
+        <w:jc w:val="left"/>
+      </w:pPr>
+      <w:r>
+        <w:rPr>
+          <w:rFonts w:ascii="Arial" w:cs="Arial" w:eastAsia="Arial" w:hAnsi="Arial"/>
+          <w:b w:val="false"/>
+          <w:bCs w:val="false"/>
+          <w:i w:val="false"/>
+          <w:iCs w:val="false"/>
+          <w:color w:val="1f1f1f"/>
+          <w:sz w:val="22"/>
+          <w:szCs w:val="22"/>
+        </w:rPr>
+        <w:t xml:space="preserve">Берём 20 фотографий, которые дошли до ретуши и были отбракованы клиентом в финале. Это двадцать часов работы ретушёра. Деньги, которые кто-то вынужден списать. В следующем сезоне история повторится: эти же типы кадров снова снимут, снова отретушируют, снова выкинут. Потому что в прошлом проекте эта история нигде не сохранилась.</w:t>
+      </w:r>
+    </w:p>
+    <w:p>
+      <w:pPr>
+        <w:pStyle w:val="Heading3"/>
+        <w:spacing w:after="120" w:before="200"/>
+      </w:pPr>
+      <w:r>
+        <w:rPr>
+          <w:rFonts w:ascii="Arial" w:cs="Arial" w:eastAsia="Arial" w:hAnsi="Arial"/>
+          <w:b/>
+          <w:bCs/>
+          <w:color w:val="111111"/>
+          <w:sz w:val="22"/>
+          <w:szCs w:val="22"/>
+        </w:rPr>
+        <w:t xml:space="preserve">«А за что я плачу?»</w:t>
+      </w:r>
+    </w:p>
+    <w:p>
+      <w:pPr>
+        <w:spacing w:after="120" w:line="300"/>
+        <w:jc w:val="left"/>
+      </w:pPr>
+      <w:r>
+        <w:rPr>
+          <w:rFonts w:ascii="Arial" w:cs="Arial" w:eastAsia="Arial" w:hAnsi="Arial"/>
+          <w:b w:val="false"/>
+          <w:bCs w:val="false"/>
+          <w:i w:val="false"/>
+          <w:iCs w:val="false"/>
+          <w:color w:val="1f1f1f"/>
+          <w:sz w:val="22"/>
+          <w:szCs w:val="22"/>
+        </w:rPr>
+        <w:t xml:space="preserve">Клиент видит 300 финальных кадров. Он не видит ни 3000 исходников, ни 15 итераций ретуши, ни семи согласований под разные каналы. Поэтому любой разговор о стоимости проходит по шаблону «фото же всего тридцать, почему так дорого». Когда история проекта видна — виден и масштаб работы, который за эти 300 кадров стоит.</w:t>
+      </w:r>
+    </w:p>
+    <w:p>
+      <w:pPr>
+        <w:pBdr>
+          <w:bottom w:val="single" w:color="CCCCCC" w:sz="6" w:space="1"/>
+        </w:pBdr>
+        <w:spacing w:after="200" w:before="120"/>
+      </w:pPr>
+      <w:r>
+        <w:rPr>
+          <w:rFonts w:ascii="Arial" w:cs="Arial" w:eastAsia="Arial" w:hAnsi="Arial"/>
+          <w:sz w:val="2"/>
+          <w:szCs w:val="2"/>
+        </w:rPr>
+        <w:t xml:space="preserve"/>
+      </w:r>
+    </w:p>
+    <w:p>
+      <w:pPr>
+        <w:spacing w:after="120" w:line="300"/>
+        <w:jc w:val="left"/>
+      </w:pPr>
+      <w:r>
+        <w:rPr>
+          <w:rFonts w:ascii="Arial" w:cs="Arial" w:eastAsia="Arial" w:hAnsi="Arial"/>
+          <w:b w:val="false"/>
+          <w:bCs w:val="false"/>
+          <w:i w:val="false"/>
+          <w:iCs w:val="false"/>
+          <w:color w:val="1f1f1f"/>
+          <w:sz w:val="22"/>
+          <w:szCs w:val="22"/>
+        </w:rPr>
+        <w:t xml:space="preserve">Все команды разные. Единой ролевой модели у съёмочного процесса нет — и, по-моему, её не должно быть. Именно поэтому Maket CP не навязывает ни процесс, ни ролевую модель. Он фиксирует то, что команда и так делает: кто какое решение принял, когда, по какому кадру. За счёт этого логирования действий у проекта появляется видимая ткань — её можно прочитать, на неё можно опереться, с ней можно работать.</w:t>
+      </w:r>
+    </w:p>
+    <w:p>
+      <w:r>
+        <w:br w:type="page"/>
+      </w:r>
+    </w:p>
+    <w:p>
+      <w:pPr>
+        <w:pStyle w:val="Heading1"/>
+        <w:spacing w:after="240" w:before="360"/>
+      </w:pPr>
+      <w:r>
+        <w:rPr>
+          <w:rFonts w:ascii="Arial" w:cs="Arial" w:eastAsia="Arial" w:hAnsi="Arial"/>
+          <w:b/>
+          <w:bCs/>
+          <w:color w:val="111111"/>
+          <w:sz w:val="32"/>
+          <w:szCs w:val="32"/>
+        </w:rPr>
+        <w:t xml:space="preserve">Часть II. Как я пришла к идее зеркала</w:t>
+      </w:r>
+    </w:p>
+    <w:p>
+      <w:pPr>
+        <w:pBdr>
+          <w:left w:val="single" w:color="B33A3A" w:sz="24" w:space="12"/>
+        </w:pBdr>
+        <w:spacing w:after="180" w:before="180" w:line="320"/>
+        <w:ind w:left="400" w:right="400"/>
+      </w:pPr>
+      <w:r>
+        <w:rPr>
+          <w:rFonts w:ascii="Arial" w:cs="Arial" w:eastAsia="Arial" w:hAnsi="Arial"/>
+          <w:i/>
+          <w:iCs/>
+          <w:color w:val="1f1f1f"/>
+          <w:sz w:val="22"/>
+          <w:szCs w:val="22"/>
+        </w:rPr>
+        <w:t xml:space="preserve">«Система не должна ограничивать команду. Система должна её освобождать.»</w:t>
+      </w:r>
+      <w:r>
+        <w:rPr>
+          <w:rFonts w:ascii="Arial" w:cs="Arial" w:eastAsia="Arial" w:hAnsi="Arial"/>
+          <w:color w:val="6a6a6a"/>
+          <w:sz w:val="20"/>
+          <w:szCs w:val="20"/>
+        </w:rPr>
+        <w:t xml:space="preserve">  — Ключевая формулировка Maket CP</w:t>
+      </w:r>
+    </w:p>
+    <w:p>
+      <w:pPr>
+        <w:spacing w:after="120" w:line="300"/>
+        <w:jc w:val="left"/>
+      </w:pPr>
+      <w:r>
+        <w:rPr>
+          <w:rFonts w:ascii="Arial" w:cs="Arial" w:eastAsia="Arial" w:hAnsi="Arial"/>
+          <w:b w:val="false"/>
+          <w:bCs w:val="false"/>
+          <w:i w:val="false"/>
+          <w:iCs w:val="false"/>
+          <w:color w:val="1f1f1f"/>
+          <w:sz w:val="22"/>
+          <w:szCs w:val="22"/>
+        </w:rPr>
+        <w:t xml:space="preserve">Любой таск-трекер — Trello, Asana, Notion, Jira — требует одного и того же: когда что-то произошло в реальной работе, кто-то должен пойти в систему и это отметить. Перенести карточку. Поставить галочку. Приложить новый файл. Это работа поверх работы. В съёмочных командах она не приживается: после второго-третьего проекта все возвращаются в чат и на диск, потому что там всё происходит естественно. Это не проблема дисциплины — это архитектурное свойство таск-трекеров. Они спрашивают «как надо было», а не «как есть».</w:t>
+      </w:r>
+    </w:p>
+    <w:p>
+      <w:pPr>
+        <w:pStyle w:val="Heading2"/>
+        <w:spacing w:after="180" w:before="280"/>
+      </w:pPr>
+      <w:r>
+        <w:rPr>
+          <w:rFonts w:ascii="Arial" w:cs="Arial" w:eastAsia="Arial" w:hAnsi="Arial"/>
+          <w:b/>
+          <w:bCs/>
+          <w:color w:val="111111"/>
+          <w:sz w:val="26"/>
+          <w:szCs w:val="26"/>
+        </w:rPr>
+        <w:t xml:space="preserve">2.1. Теория парадоксальных изменений</w:t>
+      </w:r>
+    </w:p>
+    <w:p>
+      <w:pPr>
+        <w:spacing w:after="120" w:line="300"/>
+        <w:jc w:val="left"/>
+      </w:pPr>
+      <w:r>
+        <w:rPr>
+          <w:rFonts w:ascii="Arial" w:cs="Arial" w:eastAsia="Arial" w:hAnsi="Arial"/>
+          <w:b w:val="false"/>
+          <w:bCs w:val="false"/>
+          <w:i w:val="false"/>
+          <w:iCs w:val="false"/>
+          <w:color w:val="1f1f1f"/>
+          <w:sz w:val="22"/>
+          <w:szCs w:val="22"/>
+        </w:rPr>
+        <w:t xml:space="preserve">В гештальт-психологии есть принцип: чтобы что-то изменилось, нужно сначала увидеть его таким, какое оно есть. Не переделывать, не бороться — увидеть и принять. Перемены происходят не тогда, когда человек заставляет себя стать другим, а когда он честно признаёт, что есть сейчас. Это и называется теорией парадоксальных изменений.</w:t>
+      </w:r>
+    </w:p>
+    <w:p>
+      <w:pPr>
+        <w:spacing w:after="120" w:line="300"/>
+        <w:jc w:val="left"/>
+      </w:pPr>
+      <w:r>
+        <w:rPr>
+          <w:rFonts w:ascii="Arial" w:cs="Arial" w:eastAsia="Arial" w:hAnsi="Arial"/>
+          <w:b w:val="false"/>
+          <w:bCs w:val="false"/>
+          <w:i w:val="false"/>
+          <w:iCs w:val="false"/>
+          <w:color w:val="1f1f1f"/>
+          <w:sz w:val="22"/>
+          <w:szCs w:val="22"/>
+        </w:rPr>
+        <w:t xml:space="preserve">Для процессов это работает так же. Съёмочный проект устроен именно так, как устроен, не потому что кто-то работает неаккуратно, а потому что он невидимый. Над невидимым процессом невозможно работать. Поверх него можно повесить таск-трекер, но сам процесс останется в чатах и головах — и будет продолжать жить своей жизнью.</w:t>
+      </w:r>
+    </w:p>
+    <w:p>
+      <w:pPr>
+        <w:spacing w:after="120" w:line="300"/>
+        <w:jc w:val="left"/>
+      </w:pPr>
+      <w:r>
+        <w:rPr>
+          <w:rFonts w:ascii="Arial" w:cs="Arial" w:eastAsia="Arial" w:hAnsi="Arial"/>
+          <w:b w:val="false"/>
+          <w:bCs w:val="false"/>
+          <w:i w:val="false"/>
+          <w:iCs w:val="false"/>
+          <w:color w:val="1f1f1f"/>
+          <w:sz w:val="22"/>
+          <w:szCs w:val="22"/>
+        </w:rPr>
+        <w:t xml:space="preserve">То, как команды ведут проекты сегодня, — не ошибка, которую надо чинить. Это выстроенный годами живой способ работы, его нельзя ломать системой. Его нужно поддержать за счёт системы.</w:t>
+      </w:r>
+    </w:p>
+    <w:p>
+      <w:pPr>
+        <w:pStyle w:val="Heading2"/>
+        <w:spacing w:after="180" w:before="280"/>
+      </w:pPr>
+      <w:r>
+        <w:rPr>
+          <w:rFonts w:ascii="Arial" w:cs="Arial" w:eastAsia="Arial" w:hAnsi="Arial"/>
+          <w:b/>
+          <w:bCs/>
+          <w:color w:val="111111"/>
+          <w:sz w:val="26"/>
+          <w:szCs w:val="26"/>
+        </w:rPr>
+        <w:t xml:space="preserve">2.2. Если не управлять, а показывать</w:t>
+      </w:r>
+    </w:p>
+    <w:p>
+      <w:pPr>
+        <w:spacing w:after="120" w:line="300"/>
+        <w:jc w:val="left"/>
+      </w:pPr>
+      <w:r>
+        <w:rPr>
+          <w:rFonts w:ascii="Arial" w:cs="Arial" w:eastAsia="Arial" w:hAnsi="Arial"/>
+          <w:b w:val="false"/>
+          <w:bCs w:val="false"/>
+          <w:i w:val="false"/>
+          <w:iCs w:val="false"/>
+          <w:color w:val="1f1f1f"/>
+          <w:sz w:val="22"/>
+          <w:szCs w:val="22"/>
+        </w:rPr>
+        <w:t xml:space="preserve">Отсюда главный принцип продукта: не создавать новое, а отражать то, что уже есть. Maket работает как зеркало.</w:t>
       </w:r>
     </w:p>
     <w:p>
@@ -1570,16 +1416,16 @@
           <w:sz w:val="22"/>
           <w:szCs w:val="22"/>
         </w:rPr>
-        <w:t xml:space="preserve">Согласование уже случилось в чате. </w:t>
-      </w:r>
-      <w:r>
-        <w:rPr>
-          <w:rFonts w:ascii="Arial" w:cs="Arial" w:eastAsia="Arial" w:hAnsi="Arial"/>
-          <w:color w:val="1f1f1f"/>
-          <w:sz w:val="22"/>
-          <w:szCs w:val="22"/>
-        </w:rPr>
-        <w:t xml:space="preserve">Я записываю его как событие — без того чтобы переписывать всё заново в систему.</w:t>
+        <w:t xml:space="preserve">Фотографии уже лежат в папках. </w:t>
+      </w:r>
+      <w:r>
+        <w:rPr>
+          <w:rFonts w:ascii="Arial" w:cs="Arial" w:eastAsia="Arial" w:hAnsi="Arial"/>
+          <w:color w:val="1f1f1f"/>
+          <w:sz w:val="22"/>
+          <w:szCs w:val="22"/>
+        </w:rPr>
+        <w:t xml:space="preserve">Maket показывает их как карточки — команде не нужно вручную «заносить» файлы в систему.</w:t>
       </w:r>
     </w:p>
     <w:p>
@@ -1600,90 +1446,16 @@
           <w:sz w:val="22"/>
           <w:szCs w:val="22"/>
         </w:rPr>
-        <w:t xml:space="preserve">Пайплайн ничего не двигает. </w:t>
-      </w:r>
-      <w:r>
-        <w:rPr>
-          <w:rFonts w:ascii="Arial" w:cs="Arial" w:eastAsia="Arial" w:hAnsi="Arial"/>
-          <w:color w:val="1f1f1f"/>
-          <w:sz w:val="22"/>
-          <w:szCs w:val="22"/>
-        </w:rPr>
-        <w:t xml:space="preserve">Он просто показывает, где фото сейчас находится.</w:t>
-      </w:r>
-    </w:p>
-    <w:p>
-      <w:pPr>
-        <w:spacing w:after="120" w:line="300"/>
-        <w:jc w:val="left"/>
-      </w:pPr>
-      <w:r>
-        <w:rPr>
-          <w:rFonts w:ascii="Arial" w:cs="Arial" w:eastAsia="Arial" w:hAnsi="Arial"/>
-          <w:b w:val="false"/>
-          <w:bCs w:val="false"/>
-          <w:i w:val="false"/>
-          <w:iCs w:val="false"/>
-          <w:color w:val="1f1f1f"/>
-          <w:sz w:val="22"/>
-          <w:szCs w:val="22"/>
-        </w:rPr>
-        <w:t xml:space="preserve">Разница вроде бы тонкая, но на деле меняет всё. Мы не спрашиваем «куда перетащить фотографию?» — мы спрашиваем «что с ней произошло?» — и показываем это одинаково фотографу, клиенту и ретушёру. Один язык, один объект, один статус.</w:t>
-      </w:r>
-    </w:p>
-    <w:p>
-      <w:pPr>
-        <w:pStyle w:val="Heading2"/>
-        <w:spacing w:after="180" w:before="280"/>
-      </w:pPr>
-      <w:r>
-        <w:rPr>
-          <w:rFonts w:ascii="Arial" w:cs="Arial" w:eastAsia="Arial" w:hAnsi="Arial"/>
-          <w:b/>
-          <w:bCs/>
-          <w:color w:val="111111"/>
-          <w:sz w:val="26"/>
-          <w:szCs w:val="26"/>
-        </w:rPr>
-        <w:t xml:space="preserve">2.3. Один маршрут для разных типов контента</w:t>
-      </w:r>
-    </w:p>
-    <w:p>
-      <w:pPr>
-        <w:spacing w:after="120" w:line="300"/>
-        <w:jc w:val="left"/>
-      </w:pPr>
-      <w:r>
-        <w:rPr>
-          <w:rFonts w:ascii="Arial" w:cs="Arial" w:eastAsia="Arial" w:hAnsi="Arial"/>
-          <w:b w:val="false"/>
-          <w:bCs w:val="false"/>
-          <w:i w:val="false"/>
-          <w:iCs w:val="false"/>
-          <w:color w:val="1f1f1f"/>
-          <w:sz w:val="22"/>
-          <w:szCs w:val="22"/>
-        </w:rPr>
-        <w:t xml:space="preserve">Кадр для fashion-каталога, для мебельного магазина, для косметики и даже AI-сгенерированный продукт — все они идут одним и тем же путём. Меняется источник, не меняется маршрут.</w:t>
-      </w:r>
-    </w:p>
-    <w:p>
-      <w:pPr>
-        <w:spacing w:after="120" w:line="300"/>
-        <w:jc w:val="left"/>
-      </w:pPr>
-      <w:r>
-        <w:rPr>
-          <w:rFonts w:ascii="Arial" w:cs="Arial" w:eastAsia="Arial" w:hAnsi="Arial"/>
-          <w:b w:val="false"/>
-          <w:bCs w:val="false"/>
-          <w:i w:val="false"/>
-          <w:iCs w:val="false"/>
-          <w:color w:val="1f1f1f"/>
-          <w:sz w:val="22"/>
-          <w:szCs w:val="22"/>
-        </w:rPr>
-        <w:t xml:space="preserve">Условная цепочка выглядит так:</w:t>
+        <w:t xml:space="preserve">Отбор уже произошёл — в головах команды. </w:t>
+      </w:r>
+      <w:r>
+        <w:rPr>
+          <w:rFonts w:ascii="Arial" w:cs="Arial" w:eastAsia="Arial" w:hAnsi="Arial"/>
+          <w:color w:val="1f1f1f"/>
+          <w:sz w:val="22"/>
+          <w:szCs w:val="22"/>
+        </w:rPr>
+        <w:t xml:space="preserve">Maket даёт разложить его в структуру за один клик, с фильтрами по звёздам, категориям и каналам.</w:t>
       </w:r>
     </w:p>
     <w:p>
@@ -1698,11 +1470,22 @@
       <w:r>
         <w:rPr>
           <w:rFonts w:ascii="Arial" w:cs="Arial" w:eastAsia="Arial" w:hAnsi="Arial"/>
-          <w:color w:val="1f1f1f"/>
-          <w:sz w:val="22"/>
-          <w:szCs w:val="22"/>
-        </w:rPr>
-        <w:t xml:space="preserve">Превью — отсекаем явный технический брак сразу после съёмки.</w:t>
+          <w:b/>
+          <w:bCs/>
+          <w:color w:val="1f1f1f"/>
+          <w:sz w:val="22"/>
+          <w:szCs w:val="22"/>
+        </w:rPr>
+        <w:t xml:space="preserve">Согласование уже случилось — в чате или на встрече. </w:t>
+      </w:r>
+      <w:r>
+        <w:rPr>
+          <w:rFonts w:ascii="Arial" w:cs="Arial" w:eastAsia="Arial" w:hAnsi="Arial"/>
+          <w:color w:val="1f1f1f"/>
+          <w:sz w:val="22"/>
+          <w:szCs w:val="22"/>
+        </w:rPr>
+        <w:t xml:space="preserve">Maket записывает его как событие с автором и временем — без того чтобы переписывать всё заново.</w:t>
       </w:r>
     </w:p>
     <w:p>
@@ -1717,11 +1500,96 @@
       <w:r>
         <w:rPr>
           <w:rFonts w:ascii="Arial" w:cs="Arial" w:eastAsia="Arial" w:hAnsi="Arial"/>
-          <w:color w:val="1f1f1f"/>
-          <w:sz w:val="22"/>
-          <w:szCs w:val="22"/>
-        </w:rPr>
-        <w:t xml:space="preserve">Отбор команды — фотограф со стилистом решают, что идёт клиенту.</w:t>
+          <w:b/>
+          <w:bCs/>
+          <w:color w:val="1f1f1f"/>
+          <w:sz w:val="22"/>
+          <w:szCs w:val="22"/>
+        </w:rPr>
+        <w:t xml:space="preserve">Пайплайн ничего не двигает. </w:t>
+      </w:r>
+      <w:r>
+        <w:rPr>
+          <w:rFonts w:ascii="Arial" w:cs="Arial" w:eastAsia="Arial" w:hAnsi="Arial"/>
+          <w:color w:val="1f1f1f"/>
+          <w:sz w:val="22"/>
+          <w:szCs w:val="22"/>
+        </w:rPr>
+        <w:t xml:space="preserve">Он отражает, где фото сейчас находится, по тем действиям, которые с ним уже сделали.</w:t>
+      </w:r>
+    </w:p>
+    <w:p>
+      <w:pPr>
+        <w:spacing w:after="120" w:line="300"/>
+        <w:jc w:val="left"/>
+      </w:pPr>
+      <w:r>
+        <w:rPr>
+          <w:rFonts w:ascii="Arial" w:cs="Arial" w:eastAsia="Arial" w:hAnsi="Arial"/>
+          <w:b w:val="false"/>
+          <w:bCs w:val="false"/>
+          <w:i w:val="false"/>
+          <w:iCs w:val="false"/>
+          <w:color w:val="1f1f1f"/>
+          <w:sz w:val="22"/>
+          <w:szCs w:val="22"/>
+        </w:rPr>
+        <w:t xml:space="preserve">Разница вроде бы тонкая, но меняет всё. Вопрос к системе не «куда перетащить фотографию?», а «что с ней произошло?». И ответ выглядит одинаково для команды и для клиента: один язык, один объект, один статус.</w:t>
+      </w:r>
+    </w:p>
+    <w:p>
+      <w:pPr>
+        <w:pStyle w:val="Heading2"/>
+        <w:spacing w:after="180" w:before="280"/>
+      </w:pPr>
+      <w:r>
+        <w:rPr>
+          <w:rFonts w:ascii="Arial" w:cs="Arial" w:eastAsia="Arial" w:hAnsi="Arial"/>
+          <w:b/>
+          <w:bCs/>
+          <w:color w:val="111111"/>
+          <w:sz w:val="26"/>
+          <w:szCs w:val="26"/>
+        </w:rPr>
+        <w:t xml:space="preserve">2.3. Один набор кирпичей — разные маршруты</w:t>
+      </w:r>
+    </w:p>
+    <w:p>
+      <w:pPr>
+        <w:spacing w:after="120" w:line="300"/>
+        <w:jc w:val="left"/>
+      </w:pPr>
+      <w:r>
+        <w:rPr>
+          <w:rFonts w:ascii="Arial" w:cs="Arial" w:eastAsia="Arial" w:hAnsi="Arial"/>
+          <w:b w:val="false"/>
+          <w:bCs w:val="false"/>
+          <w:i w:val="false"/>
+          <w:iCs w:val="false"/>
+          <w:color w:val="1f1f1f"/>
+          <w:sz w:val="22"/>
+          <w:szCs w:val="22"/>
+        </w:rPr>
+        <w:t xml:space="preserve">Команды идут разными маршрутами. И это не про то, что у них разный контент или разные продукты — это про то, что у них разные команды. Разные ролевые модели, разный порядок действий, разные технические решения. Где-то цветокоррекцию делает отдельный специалист до ретуши, где-то она растворена внутри ретуши. Где-то клиент смотрит отбор подряд в один заход, где-то — тремя итерациями по партиям. Где-то ретушёр согласовывает правки с фотографом, где-то — напрямую с клиентом. Всё это нормально.</w:t>
+      </w:r>
+    </w:p>
+    <w:p>
+      <w:pPr>
+        <w:spacing w:after="120" w:line="300"/>
+        <w:jc w:val="left"/>
+      </w:pPr>
+      <w:r>
+        <w:rPr>
+          <w:rFonts w:ascii="Arial" w:cs="Arial" w:eastAsia="Arial" w:hAnsi="Arial"/>
+          <w:b w:val="false"/>
+          <w:bCs w:val="false"/>
+          <w:i w:val="false"/>
+          <w:iCs w:val="false"/>
+          <w:color w:val="1f1f1f"/>
+          <w:sz w:val="22"/>
+          <w:szCs w:val="22"/>
+        </w:rPr>
+        <w:t xml:space="preserve">Но кирпичи, из которых эти маршруты собираются, — одни и те же. В проекте есть опорные этапы:</w:t>
       </w:r>
     </w:p>
     <w:p>
@@ -1740,7 +1608,7 @@
           <w:sz w:val="22"/>
           <w:szCs w:val="22"/>
         </w:rPr>
-        <w:t xml:space="preserve">Отбор клиента — клиент смотрит, согласовывает или возвращает.</w:t>
+        <w:t xml:space="preserve">Превью — отсечение явного технического брака сразу после съёмки.</w:t>
       </w:r>
     </w:p>
     <w:p>
@@ -1759,7 +1627,7 @@
           <w:sz w:val="22"/>
           <w:szCs w:val="22"/>
         </w:rPr>
-        <w:t xml:space="preserve">Цветокоррекция — первичная работа с тоном и светом.</w:t>
+        <w:t xml:space="preserve">Отбор команды — решение, что идёт клиенту.</w:t>
       </w:r>
     </w:p>
     <w:p>
@@ -1778,7 +1646,7 @@
           <w:sz w:val="22"/>
           <w:szCs w:val="22"/>
         </w:rPr>
-        <w:t xml:space="preserve">Комментарии на ретушь — список правок по каждому кадру.</w:t>
+        <w:t xml:space="preserve">Отбор клиента — смотрит, согласовывает или возвращает.</w:t>
       </w:r>
     </w:p>
     <w:p>
@@ -1797,7 +1665,7 @@
           <w:sz w:val="22"/>
           <w:szCs w:val="22"/>
         </w:rPr>
-        <w:t xml:space="preserve">Ретушь — исполняем правки.</w:t>
+        <w:t xml:space="preserve">Цветокоррекция — первичная работа с тоном и светом.</w:t>
       </w:r>
     </w:p>
     <w:p>
@@ -1816,7 +1684,7 @@
           <w:sz w:val="22"/>
           <w:szCs w:val="22"/>
         </w:rPr>
-        <w:t xml:space="preserve">Согласование ретуши — финальная проверка.</w:t>
+        <w:t xml:space="preserve">Комментарии на ретушь — список правок по каждому кадру.</w:t>
       </w:r>
     </w:p>
     <w:p>
@@ -1835,635 +1703,7 @@
           <w:sz w:val="22"/>
           <w:szCs w:val="22"/>
         </w:rPr>
-        <w:t xml:space="preserve">Адаптация под каналы — версии для маркетплейса, сайта, соцсетей.</w:t>
-      </w:r>
-    </w:p>
-    <w:p>
-      <w:pPr>
-        <w:spacing w:after="120" w:line="300"/>
-        <w:jc w:val="left"/>
-      </w:pPr>
-      <w:r>
-        <w:rPr>
-          <w:rFonts w:ascii="Arial" w:cs="Arial" w:eastAsia="Arial" w:hAnsi="Arial"/>
-          <w:b w:val="false"/>
-          <w:bCs w:val="false"/>
-          <w:i w:val="false"/>
-          <w:iCs w:val="false"/>
-          <w:color w:val="1f1f1f"/>
-          <w:sz w:val="22"/>
-          <w:szCs w:val="22"/>
-        </w:rPr>
-        <w:t xml:space="preserve">Это опорные этапы. Конкретная команда может пропустить часть — если клиент не смотрит цветокоррекцию отдельно, а вся работа с тоном идёт внутри ретуши, — или добавить свои. Пайплайн в Maket CP адаптируется под реальный процесс, а не заставляет его выстраиваться по нашему расписанию.</w:t>
-      </w:r>
-    </w:p>
-    <w:p>
-      <w:pPr>
-        <w:spacing w:after="120" w:line="300"/>
-        <w:jc w:val="left"/>
-      </w:pPr>
-      <w:r>
-        <w:rPr>
-          <w:rFonts w:ascii="Arial" w:cs="Arial" w:eastAsia="Arial" w:hAnsi="Arial"/>
-          <w:b w:val="false"/>
-          <w:bCs w:val="false"/>
-          <w:i w:val="false"/>
-          <w:iCs w:val="false"/>
-          <w:color w:val="1f1f1f"/>
-          <w:sz w:val="22"/>
-          <w:szCs w:val="22"/>
-        </w:rPr>
-        <w:t xml:space="preserve">И главное — маршрут работает не для всего проекта сразу, а для каждого отдельного кадра. Проект — это воронка, в которой разные фото находятся на разных этапах. Если у меня 30 кадров на ретуши, а 5 на доработке у стилиста — мой проект не «на ретуши». Он на двух этапах одновременно. И это нормальное состояние, а не признак беспорядка.</w:t>
-      </w:r>
-    </w:p>
-    <w:p>
-      <w:r>
-        <w:br w:type="page"/>
-      </w:r>
-    </w:p>
-    <w:p>
-      <w:pPr>
-        <w:pStyle w:val="Heading1"/>
-        <w:spacing w:after="240" w:before="360"/>
-      </w:pPr>
-      <w:r>
-        <w:rPr>
-          <w:rFonts w:ascii="Arial" w:cs="Arial" w:eastAsia="Arial" w:hAnsi="Arial"/>
-          <w:b/>
-          <w:bCs/>
-          <w:color w:val="111111"/>
-          <w:sz w:val="32"/>
-          <w:szCs w:val="32"/>
-        </w:rPr>
-        <w:t xml:space="preserve">Часть III. Как устроен Maket CP</w:t>
-      </w:r>
-    </w:p>
-    <w:p>
-      <w:pPr>
-        <w:spacing w:after="120" w:line="300"/>
-        <w:jc w:val="left"/>
-      </w:pPr>
-      <w:r>
-        <w:rPr>
-          <w:rFonts w:ascii="Arial" w:cs="Arial" w:eastAsia="Arial" w:hAnsi="Arial"/>
-          <w:b w:val="false"/>
-          <w:bCs w:val="false"/>
-          <w:i w:val="false"/>
-          <w:iCs w:val="false"/>
-          <w:color w:val="1f1f1f"/>
-          <w:sz w:val="22"/>
-          <w:szCs w:val="22"/>
-        </w:rPr>
-        <w:t xml:space="preserve">Maket CP — это десктопное приложение для фотографа, встроенное в привычный рабочий процесс вокруг Capture One, и веб-интерфейс для клиента и ретушёра. Оба работают с одним облаком: что я делаю локально — сразу видит клиент по ссылке. Клиент согласовал — я вижу в тот же момент. Никаких «я вышлю вам на почту».</w:t>
-      </w:r>
-    </w:p>
-    <w:p>
-      <w:pPr>
-        <w:pStyle w:val="Heading2"/>
-        <w:spacing w:after="180" w:before="280"/>
-      </w:pPr>
-      <w:r>
-        <w:rPr>
-          <w:rFonts w:ascii="Arial" w:cs="Arial" w:eastAsia="Arial" w:hAnsi="Arial"/>
-          <w:b/>
-          <w:bCs/>
-          <w:color w:val="111111"/>
-          <w:sz w:val="26"/>
-          <w:szCs w:val="26"/>
-        </w:rPr>
-        <w:t xml:space="preserve">3.1. Точка соприкосновения разных систем</w:t>
-      </w:r>
-    </w:p>
-    <w:p>
-      <w:pPr>
-        <w:spacing w:after="120" w:line="300"/>
-        <w:jc w:val="left"/>
-      </w:pPr>
-      <w:r>
-        <w:rPr>
-          <w:rFonts w:ascii="Arial" w:cs="Arial" w:eastAsia="Arial" w:hAnsi="Arial"/>
-          <w:b w:val="false"/>
-          <w:bCs w:val="false"/>
-          <w:i w:val="false"/>
-          <w:iCs w:val="false"/>
-          <w:color w:val="1f1f1f"/>
-          <w:sz w:val="22"/>
-          <w:szCs w:val="22"/>
-        </w:rPr>
-        <w:t xml:space="preserve">Все участники проекта уже работают в своих инструментах — у фотографа Capture One, у ретушёра Photoshop, у клиента почта и чат, у контент-менеджера CMS. Maket CP не пытается всех перевести в один интерфейс. Он становится точкой соприкосновения: куда сходятся превью, решения, правки и версии, и откуда каждый снова расходится к своим инструментам.</w:t>
-      </w:r>
-    </w:p>
-    <w:p>
-      <w:pPr>
-        <w:spacing w:after="120" w:line="300"/>
-        <w:jc w:val="left"/>
-      </w:pPr>
-      <w:r>
-        <w:rPr>
-          <w:rFonts w:ascii="Arial" w:cs="Arial" w:eastAsia="Arial" w:hAnsi="Arial"/>
-          <w:b w:val="false"/>
-          <w:bCs w:val="false"/>
-          <w:i w:val="false"/>
-          <w:iCs w:val="false"/>
-          <w:color w:val="1f1f1f"/>
-          <w:sz w:val="22"/>
-          <w:szCs w:val="22"/>
-        </w:rPr>
-        <w:t xml:space="preserve">Ролей на практике больше, чем я обычно перечисляю. Фотограф, продюсер, ассистент, стилист, клиент, креативный директор, бренд-менеджер, ретушёр, контент-менеджер, иногда — маркетолог. В разных командах их состав и полномочия сильно различаются. Я не пытаюсь жёстко закрепить за каждой ролью набор прав. Maket CP ничего не блокирует. Он просто записывает, кто что сделал и когда. Дальше команда сама решает, какая роль что делает — и это решение может меняться от проекта к проекту.</w:t>
-      </w:r>
-    </w:p>
-    <w:p>
-      <w:pPr>
-        <w:spacing w:after="120" w:line="300"/>
-        <w:jc w:val="left"/>
-      </w:pPr>
-      <w:r>
-        <w:rPr>
-          <w:rFonts w:ascii="Arial" w:cs="Arial" w:eastAsia="Arial" w:hAnsi="Arial"/>
-          <w:b w:val="false"/>
-          <w:bCs w:val="false"/>
-          <w:i w:val="false"/>
-          <w:iCs w:val="false"/>
-          <w:color w:val="1f1f1f"/>
-          <w:sz w:val="22"/>
-          <w:szCs w:val="22"/>
-        </w:rPr>
-        <w:t xml:space="preserve">Три типа пользователей, вокруг которых я строю интерфейсы:</w:t>
-      </w:r>
-    </w:p>
-    <w:tbl>
-      <w:tblPr>
-        <w:tblW w:type="dxa" w:w="9026"/>
-        <w:tblBorders>
-          <w:top w:val="single" w:color="auto" w:sz="4"/>
-          <w:left w:val="single" w:color="auto" w:sz="4"/>
-          <w:bottom w:val="single" w:color="auto" w:sz="4"/>
-          <w:right w:val="single" w:color="auto" w:sz="4"/>
-          <w:insideH w:val="single" w:color="auto" w:sz="4"/>
-          <w:insideV w:val="single" w:color="auto" w:sz="4"/>
-        </w:tblBorders>
-      </w:tblPr>
-      <w:tblGrid>
-        <w:gridCol w:w="2256"/>
-        <w:gridCol w:w="4513"/>
-        <w:gridCol w:w="2257"/>
-      </w:tblGrid>
-      <w:tr>
-        <w:trPr>
-          <w:tblHeader/>
-        </w:trPr>
-        <w:tc>
-          <w:tcPr>
-            <w:tcW w:type="dxa" w:w="2256"/>
-            <w:tcBorders>
-              <w:top w:val="single" w:color="D0D0D0" w:sz="4"/>
-              <w:left w:val="single" w:color="D0D0D0" w:sz="4"/>
-              <w:bottom w:val="single" w:color="D0D0D0" w:sz="4"/>
-              <w:right w:val="single" w:color="D0D0D0" w:sz="4"/>
-            </w:tcBorders>
-            <w:shd w:fill="F0F0F0" w:val="clear"/>
-            <w:tcMar>
-              <w:top w:type="dxa" w:w="120"/>
-              <w:left w:type="dxa" w:w="160"/>
-              <w:bottom w:type="dxa" w:w="120"/>
-              <w:right w:type="dxa" w:w="160"/>
-            </w:tcMar>
-          </w:tcPr>
-          <w:p>
-            <w:r>
-              <w:rPr>
-                <w:rFonts w:ascii="Arial" w:cs="Arial" w:eastAsia="Arial" w:hAnsi="Arial"/>
-                <w:b/>
-                <w:bCs/>
-                <w:color w:val="111111"/>
-                <w:sz w:val="21"/>
-                <w:szCs w:val="21"/>
-              </w:rPr>
-              <w:t xml:space="preserve">Роль</w:t>
-            </w:r>
-          </w:p>
-        </w:tc>
-        <w:tc>
-          <w:tcPr>
-            <w:tcW w:type="dxa" w:w="4513"/>
-            <w:tcBorders>
-              <w:top w:val="single" w:color="D0D0D0" w:sz="4"/>
-              <w:left w:val="single" w:color="D0D0D0" w:sz="4"/>
-              <w:bottom w:val="single" w:color="D0D0D0" w:sz="4"/>
-              <w:right w:val="single" w:color="D0D0D0" w:sz="4"/>
-            </w:tcBorders>
-            <w:shd w:fill="F0F0F0" w:val="clear"/>
-            <w:tcMar>
-              <w:top w:type="dxa" w:w="120"/>
-              <w:left w:type="dxa" w:w="160"/>
-              <w:bottom w:type="dxa" w:w="120"/>
-              <w:right w:type="dxa" w:w="160"/>
-            </w:tcMar>
-          </w:tcPr>
-          <w:p>
-            <w:r>
-              <w:rPr>
-                <w:rFonts w:ascii="Arial" w:cs="Arial" w:eastAsia="Arial" w:hAnsi="Arial"/>
-                <w:b/>
-                <w:bCs/>
-                <w:color w:val="111111"/>
-                <w:sz w:val="21"/>
-                <w:szCs w:val="21"/>
-              </w:rPr>
-              <w:t xml:space="preserve">Как работает</w:t>
-            </w:r>
-          </w:p>
-        </w:tc>
-        <w:tc>
-          <w:tcPr>
-            <w:tcW w:type="dxa" w:w="2257"/>
-            <w:tcBorders>
-              <w:top w:val="single" w:color="D0D0D0" w:sz="4"/>
-              <w:left w:val="single" w:color="D0D0D0" w:sz="4"/>
-              <w:bottom w:val="single" w:color="D0D0D0" w:sz="4"/>
-              <w:right w:val="single" w:color="D0D0D0" w:sz="4"/>
-            </w:tcBorders>
-            <w:shd w:fill="F0F0F0" w:val="clear"/>
-            <w:tcMar>
-              <w:top w:type="dxa" w:w="120"/>
-              <w:left w:type="dxa" w:w="160"/>
-              <w:bottom w:type="dxa" w:w="120"/>
-              <w:right w:type="dxa" w:w="160"/>
-            </w:tcMar>
-          </w:tcPr>
-          <w:p>
-            <w:r>
-              <w:rPr>
-                <w:rFonts w:ascii="Arial" w:cs="Arial" w:eastAsia="Arial" w:hAnsi="Arial"/>
-                <w:b/>
-                <w:bCs/>
-                <w:color w:val="111111"/>
-                <w:sz w:val="21"/>
-                <w:szCs w:val="21"/>
-              </w:rPr>
-              <w:t xml:space="preserve"/>
-            </w:r>
-          </w:p>
-        </w:tc>
-      </w:tr>
-      <w:tr>
-        <w:tc>
-          <w:tcPr>
-            <w:tcW w:type="dxa" w:w="2256"/>
-            <w:tcBorders>
-              <w:top w:val="single" w:color="D0D0D0" w:sz="4"/>
-              <w:left w:val="single" w:color="D0D0D0" w:sz="4"/>
-              <w:bottom w:val="single" w:color="D0D0D0" w:sz="4"/>
-              <w:right w:val="single" w:color="D0D0D0" w:sz="4"/>
-            </w:tcBorders>
-            <w:tcMar>
-              <w:top w:type="dxa" w:w="110"/>
-              <w:left w:type="dxa" w:w="160"/>
-              <w:bottom w:type="dxa" w:w="110"/>
-              <w:right w:type="dxa" w:w="160"/>
-            </w:tcMar>
-          </w:tcPr>
-          <w:p>
-            <w:pPr>
-              <w:spacing w:line="280"/>
-            </w:pPr>
-            <w:r>
-              <w:rPr>
-                <w:rFonts w:ascii="Arial" w:cs="Arial" w:eastAsia="Arial" w:hAnsi="Arial"/>
-                <w:color w:val="1f1f1f"/>
-                <w:sz w:val="20"/>
-                <w:szCs w:val="20"/>
-              </w:rPr>
-              <w:t xml:space="preserve">Фотограф / продюсер</w:t>
-            </w:r>
-          </w:p>
-        </w:tc>
-        <w:tc>
-          <w:tcPr>
-            <w:tcW w:type="dxa" w:w="4513"/>
-            <w:tcBorders>
-              <w:top w:val="single" w:color="D0D0D0" w:sz="4"/>
-              <w:left w:val="single" w:color="D0D0D0" w:sz="4"/>
-              <w:bottom w:val="single" w:color="D0D0D0" w:sz="4"/>
-              <w:right w:val="single" w:color="D0D0D0" w:sz="4"/>
-            </w:tcBorders>
-            <w:tcMar>
-              <w:top w:type="dxa" w:w="110"/>
-              <w:left w:type="dxa" w:w="160"/>
-              <w:bottom w:type="dxa" w:w="110"/>
-              <w:right w:type="dxa" w:w="160"/>
-            </w:tcMar>
-          </w:tcPr>
-          <w:p>
-            <w:pPr>
-              <w:spacing w:line="280"/>
-            </w:pPr>
-            <w:r>
-              <w:rPr>
-                <w:rFonts w:ascii="Arial" w:cs="Arial" w:eastAsia="Arial" w:hAnsi="Arial"/>
-                <w:color w:val="1f1f1f"/>
-                <w:sz w:val="20"/>
-                <w:szCs w:val="20"/>
-              </w:rPr>
-              <w:t xml:space="preserve">Десктоп. Подгружает превью из Capture One, собирает карточки, раскладывает кадры в сетке, отправляет клиенту ссылку.</w:t>
-            </w:r>
-          </w:p>
-        </w:tc>
-        <w:tc>
-          <w:tcPr>
-            <w:tcW w:type="dxa" w:w="2257"/>
-            <w:tcBorders>
-              <w:top w:val="single" w:color="D0D0D0" w:sz="4"/>
-              <w:left w:val="single" w:color="D0D0D0" w:sz="4"/>
-              <w:bottom w:val="single" w:color="D0D0D0" w:sz="4"/>
-              <w:right w:val="single" w:color="D0D0D0" w:sz="4"/>
-            </w:tcBorders>
-            <w:tcMar>
-              <w:top w:type="dxa" w:w="110"/>
-              <w:left w:type="dxa" w:w="160"/>
-              <w:bottom w:type="dxa" w:w="110"/>
-              <w:right w:type="dxa" w:w="160"/>
-            </w:tcMar>
-          </w:tcPr>
-          <w:p>
-            <w:pPr>
-              <w:spacing w:line="280"/>
-            </w:pPr>
-            <w:r>
-              <w:rPr>
-                <w:rFonts w:ascii="Arial" w:cs="Arial" w:eastAsia="Arial" w:hAnsi="Arial"/>
-                <w:color w:val="1f1f1f"/>
-                <w:sz w:val="20"/>
-                <w:szCs w:val="20"/>
-              </w:rPr>
-              <w:t xml:space="preserve"/>
-            </w:r>
-          </w:p>
-        </w:tc>
-      </w:tr>
-      <w:tr>
-        <w:tc>
-          <w:tcPr>
-            <w:tcW w:type="dxa" w:w="2256"/>
-            <w:tcBorders>
-              <w:top w:val="single" w:color="D0D0D0" w:sz="4"/>
-              <w:left w:val="single" w:color="D0D0D0" w:sz="4"/>
-              <w:bottom w:val="single" w:color="D0D0D0" w:sz="4"/>
-              <w:right w:val="single" w:color="D0D0D0" w:sz="4"/>
-            </w:tcBorders>
-            <w:tcMar>
-              <w:top w:type="dxa" w:w="110"/>
-              <w:left w:type="dxa" w:w="160"/>
-              <w:bottom w:type="dxa" w:w="110"/>
-              <w:right w:type="dxa" w:w="160"/>
-            </w:tcMar>
-          </w:tcPr>
-          <w:p>
-            <w:pPr>
-              <w:spacing w:line="280"/>
-            </w:pPr>
-            <w:r>
-              <w:rPr>
-                <w:rFonts w:ascii="Arial" w:cs="Arial" w:eastAsia="Arial" w:hAnsi="Arial"/>
-                <w:color w:val="1f1f1f"/>
-                <w:sz w:val="20"/>
-                <w:szCs w:val="20"/>
-              </w:rPr>
-              <w:t xml:space="preserve">Клиент / бренд</w:t>
-            </w:r>
-          </w:p>
-        </w:tc>
-        <w:tc>
-          <w:tcPr>
-            <w:tcW w:type="dxa" w:w="4513"/>
-            <w:tcBorders>
-              <w:top w:val="single" w:color="D0D0D0" w:sz="4"/>
-              <w:left w:val="single" w:color="D0D0D0" w:sz="4"/>
-              <w:bottom w:val="single" w:color="D0D0D0" w:sz="4"/>
-              <w:right w:val="single" w:color="D0D0D0" w:sz="4"/>
-            </w:tcBorders>
-            <w:tcMar>
-              <w:top w:type="dxa" w:w="110"/>
-              <w:left w:type="dxa" w:w="160"/>
-              <w:bottom w:type="dxa" w:w="110"/>
-              <w:right w:type="dxa" w:w="160"/>
-            </w:tcMar>
-          </w:tcPr>
-          <w:p>
-            <w:pPr>
-              <w:spacing w:line="280"/>
-            </w:pPr>
-            <w:r>
-              <w:rPr>
-                <w:rFonts w:ascii="Arial" w:cs="Arial" w:eastAsia="Arial" w:hAnsi="Arial"/>
-                <w:color w:val="1f1f1f"/>
-                <w:sz w:val="20"/>
-                <w:szCs w:val="20"/>
-              </w:rPr>
-              <w:t xml:space="preserve">Веб. Открывает ссылку, смотрит карточки, пишет комментарии, согласовывает партиями. Ничего устанавливать не нужно.</w:t>
-            </w:r>
-          </w:p>
-        </w:tc>
-        <w:tc>
-          <w:tcPr>
-            <w:tcW w:type="dxa" w:w="2257"/>
-            <w:tcBorders>
-              <w:top w:val="single" w:color="D0D0D0" w:sz="4"/>
-              <w:left w:val="single" w:color="D0D0D0" w:sz="4"/>
-              <w:bottom w:val="single" w:color="D0D0D0" w:sz="4"/>
-              <w:right w:val="single" w:color="D0D0D0" w:sz="4"/>
-            </w:tcBorders>
-            <w:tcMar>
-              <w:top w:type="dxa" w:w="110"/>
-              <w:left w:type="dxa" w:w="160"/>
-              <w:bottom w:type="dxa" w:w="110"/>
-              <w:right w:type="dxa" w:w="160"/>
-            </w:tcMar>
-          </w:tcPr>
-          <w:p>
-            <w:pPr>
-              <w:spacing w:line="280"/>
-            </w:pPr>
-            <w:r>
-              <w:rPr>
-                <w:rFonts w:ascii="Arial" w:cs="Arial" w:eastAsia="Arial" w:hAnsi="Arial"/>
-                <w:color w:val="1f1f1f"/>
-                <w:sz w:val="20"/>
-                <w:szCs w:val="20"/>
-              </w:rPr>
-              <w:t xml:space="preserve"/>
-            </w:r>
-          </w:p>
-        </w:tc>
-      </w:tr>
-      <w:tr>
-        <w:tc>
-          <w:tcPr>
-            <w:tcW w:type="dxa" w:w="2256"/>
-            <w:tcBorders>
-              <w:top w:val="single" w:color="D0D0D0" w:sz="4"/>
-              <w:left w:val="single" w:color="D0D0D0" w:sz="4"/>
-              <w:bottom w:val="single" w:color="D0D0D0" w:sz="4"/>
-              <w:right w:val="single" w:color="D0D0D0" w:sz="4"/>
-            </w:tcBorders>
-            <w:tcMar>
-              <w:top w:type="dxa" w:w="110"/>
-              <w:left w:type="dxa" w:w="160"/>
-              <w:bottom w:type="dxa" w:w="110"/>
-              <w:right w:type="dxa" w:w="160"/>
-            </w:tcMar>
-          </w:tcPr>
-          <w:p>
-            <w:pPr>
-              <w:spacing w:line="280"/>
-            </w:pPr>
-            <w:r>
-              <w:rPr>
-                <w:rFonts w:ascii="Arial" w:cs="Arial" w:eastAsia="Arial" w:hAnsi="Arial"/>
-                <w:color w:val="1f1f1f"/>
-                <w:sz w:val="20"/>
-                <w:szCs w:val="20"/>
-              </w:rPr>
-              <w:t xml:space="preserve">Ретушёр</w:t>
-            </w:r>
-          </w:p>
-        </w:tc>
-        <w:tc>
-          <w:tcPr>
-            <w:tcW w:type="dxa" w:w="4513"/>
-            <w:tcBorders>
-              <w:top w:val="single" w:color="D0D0D0" w:sz="4"/>
-              <w:left w:val="single" w:color="D0D0D0" w:sz="4"/>
-              <w:bottom w:val="single" w:color="D0D0D0" w:sz="4"/>
-              <w:right w:val="single" w:color="D0D0D0" w:sz="4"/>
-            </w:tcBorders>
-            <w:tcMar>
-              <w:top w:type="dxa" w:w="110"/>
-              <w:left w:type="dxa" w:w="160"/>
-              <w:bottom w:type="dxa" w:w="110"/>
-              <w:right w:type="dxa" w:w="160"/>
-            </w:tcMar>
-          </w:tcPr>
-          <w:p>
-            <w:pPr>
-              <w:spacing w:line="280"/>
-            </w:pPr>
-            <w:r>
-              <w:rPr>
-                <w:rFonts w:ascii="Arial" w:cs="Arial" w:eastAsia="Arial" w:hAnsi="Arial"/>
-                <w:color w:val="1f1f1f"/>
-                <w:sz w:val="20"/>
-                <w:szCs w:val="20"/>
-              </w:rPr>
-              <w:t xml:space="preserve">Веб. Видит список правок по каждому кадру, загружает версии, получает финальное согласование — всё в одном месте, без пересылок.</w:t>
-            </w:r>
-          </w:p>
-        </w:tc>
-        <w:tc>
-          <w:tcPr>
-            <w:tcW w:type="dxa" w:w="2257"/>
-            <w:tcBorders>
-              <w:top w:val="single" w:color="D0D0D0" w:sz="4"/>
-              <w:left w:val="single" w:color="D0D0D0" w:sz="4"/>
-              <w:bottom w:val="single" w:color="D0D0D0" w:sz="4"/>
-              <w:right w:val="single" w:color="D0D0D0" w:sz="4"/>
-            </w:tcBorders>
-            <w:tcMar>
-              <w:top w:type="dxa" w:w="110"/>
-              <w:left w:type="dxa" w:w="160"/>
-              <w:bottom w:type="dxa" w:w="110"/>
-              <w:right w:type="dxa" w:w="160"/>
-            </w:tcMar>
-          </w:tcPr>
-          <w:p>
-            <w:pPr>
-              <w:spacing w:line="280"/>
-            </w:pPr>
-            <w:r>
-              <w:rPr>
-                <w:rFonts w:ascii="Arial" w:cs="Arial" w:eastAsia="Arial" w:hAnsi="Arial"/>
-                <w:color w:val="1f1f1f"/>
-                <w:sz w:val="20"/>
-                <w:szCs w:val="20"/>
-              </w:rPr>
-              <w:t xml:space="preserve"/>
-            </w:r>
-          </w:p>
-        </w:tc>
-      </w:tr>
-    </w:tbl>
-    <w:p>
-      <w:pPr>
-        <w:spacing w:after="120" w:line="300"/>
-        <w:jc w:val="left"/>
-      </w:pPr>
-      <w:r>
-        <w:rPr>
-          <w:rFonts w:ascii="Arial" w:cs="Arial" w:eastAsia="Arial" w:hAnsi="Arial"/>
-          <w:b w:val="false"/>
-          <w:bCs w:val="false"/>
-          <w:i w:val="false"/>
-          <w:iCs w:val="false"/>
-          <w:color w:val="1f1f1f"/>
-          <w:sz w:val="22"/>
-          <w:szCs w:val="22"/>
-        </w:rPr>
-        <w:t xml:space="preserve">Роли — это не про права, а про позицию в процессе. Креативный директор бренда часто сам помогает отбирать кадры — тогда он действует как часть команды. Я иногда проверяю ретушь за ретушёром — значит, в этот момент я в его роли. Maket CP не мешает.</w:t>
-      </w:r>
-    </w:p>
-    <w:p>
-      <w:pPr>
-        <w:pStyle w:val="Heading2"/>
-        <w:spacing w:after="180" w:before="280"/>
-      </w:pPr>
-      <w:r>
-        <w:rPr>
-          <w:rFonts w:ascii="Arial" w:cs="Arial" w:eastAsia="Arial" w:hAnsi="Arial"/>
-          <w:b/>
-          <w:bCs/>
-          <w:color w:val="111111"/>
-          <w:sz w:val="26"/>
-          <w:szCs w:val="26"/>
-        </w:rPr>
-        <w:t xml:space="preserve">3.2. Нулевой порог входа</w:t>
-      </w:r>
-    </w:p>
-    <w:p>
-      <w:pPr>
-        <w:spacing w:after="120" w:line="300"/>
-        <w:jc w:val="left"/>
-      </w:pPr>
-      <w:r>
-        <w:rPr>
-          <w:rFonts w:ascii="Arial" w:cs="Arial" w:eastAsia="Arial" w:hAnsi="Arial"/>
-          <w:b w:val="false"/>
-          <w:bCs w:val="false"/>
-          <w:i w:val="false"/>
-          <w:iCs w:val="false"/>
-          <w:color w:val="1f1f1f"/>
-          <w:sz w:val="22"/>
-          <w:szCs w:val="22"/>
-        </w:rPr>
-        <w:t xml:space="preserve">С клиентом у меня принципиальная установка: пользование Maket CP должно быть нативным. Никаких «давайте я вам расскажу, как пользоваться системой» за два дня до съёмки.</w:t>
-      </w:r>
-    </w:p>
-    <w:p>
-      <w:pPr>
-        <w:spacing w:after="120" w:line="300"/>
-        <w:jc w:val="left"/>
-      </w:pPr>
-      <w:r>
-        <w:rPr>
-          <w:rFonts w:ascii="Arial" w:cs="Arial" w:eastAsia="Arial" w:hAnsi="Arial"/>
-          <w:b w:val="false"/>
-          <w:bCs w:val="false"/>
-          <w:i w:val="false"/>
-          <w:iCs w:val="false"/>
-          <w:color w:val="1f1f1f"/>
-          <w:sz w:val="22"/>
-          <w:szCs w:val="22"/>
-        </w:rPr>
-        <w:t xml:space="preserve">Каждый участник сам выбирает, как зайти:</w:t>
+        <w:t xml:space="preserve">Ретушь — исполнение правок.</w:t>
       </w:r>
     </w:p>
     <w:p>
@@ -2482,7 +1722,7 @@
           <w:sz w:val="22"/>
           <w:szCs w:val="22"/>
         </w:rPr>
-        <w:t xml:space="preserve">По магик-ссылке — открыл URL и сразу внутри проекта, без регистрации, без пароля. Идентификация действий всё равно сохраняется: Maket CP понимает, кто ты, по тому, как ты зашёл.</w:t>
+        <w:t xml:space="preserve">Согласование ретуши — финальная проверка.</w:t>
       </w:r>
     </w:p>
     <w:p>
@@ -2501,26 +1741,105 @@
           <w:sz w:val="22"/>
           <w:szCs w:val="22"/>
         </w:rPr>
-        <w:t xml:space="preserve">С регистрацией — если клиент сам так удобнее (например, у него несколько проектов одновременно и он хочет видеть их в одном месте).</w:t>
-      </w:r>
-    </w:p>
-    <w:p>
-      <w:pPr>
-        <w:spacing w:after="120" w:line="300"/>
-        <w:jc w:val="left"/>
-      </w:pPr>
-      <w:r>
-        <w:rPr>
-          <w:rFonts w:ascii="Arial" w:cs="Arial" w:eastAsia="Arial" w:hAnsi="Arial"/>
-          <w:b w:val="false"/>
-          <w:bCs w:val="false"/>
-          <w:i w:val="false"/>
-          <w:iCs w:val="false"/>
-          <w:color w:val="1f1f1f"/>
-          <w:sz w:val="22"/>
-          <w:szCs w:val="22"/>
-        </w:rPr>
-        <w:t xml:space="preserve">Единственный, кому регистрация нужна обязательно, — это владелец проекта: фотограф или продюсер. Всем остальным — опционально. Порог входа для клиента — один клик по ссылке из письма.</w:t>
+        <w:t xml:space="preserve">Адаптация под каналы — версии для маркетплейса, сайта, соцсетей.</w:t>
+      </w:r>
+    </w:p>
+    <w:p>
+      <w:pPr>
+        <w:spacing w:after="120" w:line="300"/>
+        <w:jc w:val="left"/>
+      </w:pPr>
+      <w:r>
+        <w:rPr>
+          <w:rFonts w:ascii="Arial" w:cs="Arial" w:eastAsia="Arial" w:hAnsi="Arial"/>
+          <w:b w:val="false"/>
+          <w:bCs w:val="false"/>
+          <w:i w:val="false"/>
+          <w:iCs w:val="false"/>
+          <w:color w:val="1f1f1f"/>
+          <w:sz w:val="22"/>
+          <w:szCs w:val="22"/>
+        </w:rPr>
+        <w:t xml:space="preserve">Конкретная команда собирает свой маршрут из этих кирпичей: часть пропускает, часть меняет местами, часть добавляет. Дело не в источнике и не в маршруте — дело в команде. Maket CP адаптивен и к команде, и к клиенту: он подстраивается, а не заставляет процесс выстраиваться по своему расписанию.</w:t>
+      </w:r>
+    </w:p>
+    <w:p>
+      <w:pPr>
+        <w:spacing w:after="120" w:line="300"/>
+        <w:jc w:val="left"/>
+      </w:pPr>
+      <w:r>
+        <w:rPr>
+          <w:rFonts w:ascii="Arial" w:cs="Arial" w:eastAsia="Arial" w:hAnsi="Arial"/>
+          <w:b w:val="false"/>
+          <w:bCs w:val="false"/>
+          <w:i w:val="false"/>
+          <w:iCs w:val="false"/>
+          <w:color w:val="1f1f1f"/>
+          <w:sz w:val="22"/>
+          <w:szCs w:val="22"/>
+        </w:rPr>
+        <w:t xml:space="preserve">И ещё один важный момент: маршрут работает не для всего проекта сразу, а для каждого отдельного кадра. Проект — это воронка, в которой разные кадры находятся на разных этапах. Если 30 кадров на ретуши, а 5 на доработке у стилиста — проект не «на ретуши». Он на двух этапах одновременно. И это может быть признаком нормального здорового состояния — команда работает свободно и параллельно; а может быть признаком беспорядка — и тогда об этом видно сразу. Какое именно — решают команда и клиент, и благодаря Maket CP у них теперь есть, с чем это решение принимать.</w:t>
+      </w:r>
+    </w:p>
+    <w:p>
+      <w:r>
+        <w:br w:type="page"/>
+      </w:r>
+    </w:p>
+    <w:p>
+      <w:pPr>
+        <w:pStyle w:val="Heading1"/>
+        <w:spacing w:after="240" w:before="360"/>
+      </w:pPr>
+      <w:r>
+        <w:rPr>
+          <w:rFonts w:ascii="Arial" w:cs="Arial" w:eastAsia="Arial" w:hAnsi="Arial"/>
+          <w:b/>
+          <w:bCs/>
+          <w:color w:val="111111"/>
+          <w:sz w:val="32"/>
+          <w:szCs w:val="32"/>
+        </w:rPr>
+        <w:t xml:space="preserve">Часть III. Как устроен Maket CP</w:t>
+      </w:r>
+    </w:p>
+    <w:p>
+      <w:pPr>
+        <w:spacing w:after="120" w:line="300"/>
+        <w:jc w:val="left"/>
+      </w:pPr>
+      <w:r>
+        <w:rPr>
+          <w:rFonts w:ascii="Arial" w:cs="Arial" w:eastAsia="Arial" w:hAnsi="Arial"/>
+          <w:b w:val="false"/>
+          <w:bCs w:val="false"/>
+          <w:i w:val="false"/>
+          <w:iCs w:val="false"/>
+          <w:color w:val="1f1f1f"/>
+          <w:sz w:val="22"/>
+          <w:szCs w:val="22"/>
+        </w:rPr>
+        <w:t xml:space="preserve">Maket CP — это десктопное приложение для команды, встроенное в рабочий процесс вокруг Capture One, и веб-интерфейс для клиента. Оба работают с одним облаком: что команда делает локально — сразу видит клиент. Клиент согласовал — команда видит в тот же момент.</w:t>
+      </w:r>
+    </w:p>
+    <w:p>
+      <w:pPr>
+        <w:spacing w:after="120" w:line="300"/>
+        <w:jc w:val="left"/>
+      </w:pPr>
+      <w:r>
+        <w:rPr>
+          <w:rFonts w:ascii="Arial" w:cs="Arial" w:eastAsia="Arial" w:hAnsi="Arial"/>
+          <w:b w:val="false"/>
+          <w:bCs w:val="false"/>
+          <w:i w:val="false"/>
+          <w:iCs w:val="false"/>
+          <w:color w:val="1f1f1f"/>
+          <w:sz w:val="22"/>
+          <w:szCs w:val="22"/>
+        </w:rPr>
+        <w:t xml:space="preserve">Команде Maket упрощает ровно то, что в обычном проекте съедает больше всего времени: сведение превью, общение с клиентом, пересылки версий, сверки «какая правка принята». Всё, что сейчас делается вручную в чатах и папках, внутри Maket делается один раз — и остаётся в проекте как видимая история.</w:t>
       </w:r>
     </w:p>
     <w:p>
@@ -2537,45 +1856,138 @@
           <w:sz w:val="26"/>
           <w:szCs w:val="26"/>
         </w:rPr>
-        <w:t xml:space="preserve">3.3. Контейнер — центр продукта</w:t>
-      </w:r>
-    </w:p>
-    <w:p>
-      <w:pPr>
-        <w:spacing w:after="120" w:line="300"/>
-        <w:jc w:val="left"/>
-      </w:pPr>
-      <w:r>
-        <w:rPr>
-          <w:rFonts w:ascii="Arial" w:cs="Arial" w:eastAsia="Arial" w:hAnsi="Arial"/>
-          <w:b w:val="false"/>
-          <w:bCs w:val="false"/>
-          <w:i w:val="false"/>
-          <w:iCs w:val="false"/>
-          <w:color w:val="1f1f1f"/>
-          <w:sz w:val="22"/>
-          <w:szCs w:val="22"/>
-        </w:rPr>
-        <w:t xml:space="preserve">Вокруг одного объекта у меня крутится буквально всё. Я называю его контейнером. В e-commerce контейнер — это карточка товара. В лукбуке — лук. Для соцсетей — группа кадров одного поста. Для моушн-проекта — раскадровка. Сам объект один и тот же: запланированная единица контента с нужными ракурсами, комментариями и статусом на пайплайне.</w:t>
-      </w:r>
-    </w:p>
-    <w:p>
-      <w:pPr>
-        <w:spacing w:after="120" w:line="300"/>
-        <w:jc w:val="left"/>
-      </w:pPr>
-      <w:r>
-        <w:rPr>
-          <w:rFonts w:ascii="Arial" w:cs="Arial" w:eastAsia="Arial" w:hAnsi="Arial"/>
-          <w:b w:val="false"/>
-          <w:bCs w:val="false"/>
-          <w:i w:val="false"/>
-          <w:iCs w:val="false"/>
-          <w:color w:val="1f1f1f"/>
-          <w:sz w:val="22"/>
-          <w:szCs w:val="22"/>
-        </w:rPr>
-        <w:t xml:space="preserve">В продукте это реализовано двумя интерфейсами, потому что логика работы с ними разная:</w:t>
+        <w:t xml:space="preserve">3.1. Точка соприкосновения разных систем</w:t>
+      </w:r>
+    </w:p>
+    <w:p>
+      <w:pPr>
+        <w:spacing w:after="120" w:line="300"/>
+        <w:jc w:val="left"/>
+      </w:pPr>
+      <w:r>
+        <w:rPr>
+          <w:rFonts w:ascii="Arial" w:cs="Arial" w:eastAsia="Arial" w:hAnsi="Arial"/>
+          <w:b w:val="false"/>
+          <w:bCs w:val="false"/>
+          <w:i w:val="false"/>
+          <w:iCs w:val="false"/>
+          <w:color w:val="1f1f1f"/>
+          <w:sz w:val="22"/>
+          <w:szCs w:val="22"/>
+        </w:rPr>
+        <w:t xml:space="preserve">Все участники проекта уже работают в своих инструментах — у команды Capture One и Photoshop, у клиента почта и чат, у контент-менеджера CMS, у бренда своя система учёта артикулов. Maket CP не пытается всех перевести в один интерфейс и не пытается заменить существующие инструменты. Задача другая: соприкоснуться с ними, чтобы убрать ручную работу на стыках.</w:t>
+      </w:r>
+    </w:p>
+    <w:p>
+      <w:pPr>
+        <w:spacing w:after="120" w:line="300"/>
+        <w:jc w:val="left"/>
+      </w:pPr>
+      <w:r>
+        <w:rPr>
+          <w:rFonts w:ascii="Arial" w:cs="Arial" w:eastAsia="Arial" w:hAnsi="Arial"/>
+          <w:b w:val="false"/>
+          <w:bCs w:val="false"/>
+          <w:i w:val="false"/>
+          <w:iCs w:val="false"/>
+          <w:color w:val="1f1f1f"/>
+          <w:sz w:val="22"/>
+          <w:szCs w:val="22"/>
+        </w:rPr>
+        <w:t xml:space="preserve">Самый наглядный пример — интеграция с Capture One. То, что ассистент отмечает звёздами прямо на площадке, сразу уходит в Maket. Команде не нужно отдельно выгружать превью, переименовывать файлы, складывать в папку и высылать клиенту — это всё просто происходит. В пайплайне Maket ждёт следующего шага то, что уже отобрано в Capture One.</w:t>
+      </w:r>
+    </w:p>
+    <w:p>
+      <w:pPr>
+        <w:spacing w:after="120" w:line="300"/>
+        <w:jc w:val="left"/>
+      </w:pPr>
+      <w:r>
+        <w:rPr>
+          <w:rFonts w:ascii="Arial" w:cs="Arial" w:eastAsia="Arial" w:hAnsi="Arial"/>
+          <w:b w:val="false"/>
+          <w:bCs w:val="false"/>
+          <w:i w:val="false"/>
+          <w:iCs w:val="false"/>
+          <w:color w:val="1f1f1f"/>
+          <w:sz w:val="22"/>
+          <w:szCs w:val="22"/>
+        </w:rPr>
+        <w:t xml:space="preserve">Роли в съёмочных проектах разнообразны: фотограф, продюсер, ассистент, стилист, клиент, креативный директор, бренд-менеджер, ретушёр, контент-менеджер. Состав и полномочия различаются от проекта к проекту. Maket CP ничего за ролями не закрепляет — он просто фиксирует, кто что сделал и когда. Ключевое здесь то, что момент принятия решения становится видимым: кто действительно одобрил кадр, кто вернул его на доработку, кто добавил комментарий. Это значит, что при недоступности стилиста фотограф может взять часть его обязанностей на себя — и клиент увидит, что решение принял фотограф, а не стилист, которого он ожидал. Никто не пропадает в «ну кто-то же согласовал».</w:t>
+      </w:r>
+    </w:p>
+    <w:p>
+      <w:pPr>
+        <w:spacing w:after="120" w:line="300"/>
+        <w:jc w:val="left"/>
+      </w:pPr>
+      <w:r>
+        <w:rPr>
+          <w:rFonts w:ascii="Arial" w:cs="Arial" w:eastAsia="Arial" w:hAnsi="Arial"/>
+          <w:b w:val="false"/>
+          <w:bCs w:val="false"/>
+          <w:i w:val="false"/>
+          <w:iCs w:val="false"/>
+          <w:color w:val="1f1f1f"/>
+          <w:sz w:val="22"/>
+          <w:szCs w:val="22"/>
+        </w:rPr>
+        <w:t xml:space="preserve">Дальше команда сама решает, какая роль что делает, — и это решение может меняться от проекта к проекту.</w:t>
+      </w:r>
+    </w:p>
+    <w:p>
+      <w:pPr>
+        <w:pStyle w:val="Heading2"/>
+        <w:spacing w:after="180" w:before="280"/>
+      </w:pPr>
+      <w:r>
+        <w:rPr>
+          <w:rFonts w:ascii="Arial" w:cs="Arial" w:eastAsia="Arial" w:hAnsi="Arial"/>
+          <w:b/>
+          <w:bCs/>
+          <w:color w:val="111111"/>
+          <w:sz w:val="26"/>
+          <w:szCs w:val="26"/>
+        </w:rPr>
+        <w:t xml:space="preserve">3.2. Нулевой порог входа</w:t>
+      </w:r>
+    </w:p>
+    <w:p>
+      <w:pPr>
+        <w:spacing w:after="120" w:line="300"/>
+        <w:jc w:val="left"/>
+      </w:pPr>
+      <w:r>
+        <w:rPr>
+          <w:rFonts w:ascii="Arial" w:cs="Arial" w:eastAsia="Arial" w:hAnsi="Arial"/>
+          <w:b w:val="false"/>
+          <w:bCs w:val="false"/>
+          <w:i w:val="false"/>
+          <w:iCs w:val="false"/>
+          <w:color w:val="1f1f1f"/>
+          <w:sz w:val="22"/>
+          <w:szCs w:val="22"/>
+        </w:rPr>
+        <w:t xml:space="preserve">Пользование Maket CP должно быть нативным. Никаких «давайте я вам расскажу, как пользоваться системой» за два дня до съёмки.</w:t>
+      </w:r>
+    </w:p>
+    <w:p>
+      <w:pPr>
+        <w:spacing w:after="120" w:line="300"/>
+        <w:jc w:val="left"/>
+      </w:pPr>
+      <w:r>
+        <w:rPr>
+          <w:rFonts w:ascii="Arial" w:cs="Arial" w:eastAsia="Arial" w:hAnsi="Arial"/>
+          <w:b w:val="false"/>
+          <w:bCs w:val="false"/>
+          <w:i w:val="false"/>
+          <w:iCs w:val="false"/>
+          <w:color w:val="1f1f1f"/>
+          <w:sz w:val="22"/>
+          <w:szCs w:val="22"/>
+        </w:rPr>
+        <w:t xml:space="preserve">Каждый участник сам выбирает, как зайти:</w:t>
       </w:r>
     </w:p>
     <w:p>
@@ -2590,22 +2002,11 @@
       <w:r>
         <w:rPr>
           <w:rFonts w:ascii="Arial" w:cs="Arial" w:eastAsia="Arial" w:hAnsi="Arial"/>
-          <w:b/>
-          <w:bCs/>
-          <w:color w:val="1f1f1f"/>
-          <w:sz w:val="22"/>
-          <w:szCs w:val="22"/>
-        </w:rPr>
-        <w:t xml:space="preserve">Экран для e-commerce. </w:t>
-      </w:r>
-      <w:r>
-        <w:rPr>
-          <w:rFonts w:ascii="Arial" w:cs="Arial" w:eastAsia="Arial" w:hAnsi="Arial"/>
-          <w:color w:val="1f1f1f"/>
-          <w:sz w:val="22"/>
-          <w:szCs w:val="22"/>
-        </w:rPr>
-        <w:t xml:space="preserve">Карточка товара привязана к артикулу, жёстко заданы слоты под ракурсы (общий, деталь, лайфстайл), понятная таблица «что готово, что нет».</w:t>
+          <w:color w:val="1f1f1f"/>
+          <w:sz w:val="22"/>
+          <w:szCs w:val="22"/>
+        </w:rPr>
+        <w:t xml:space="preserve">По магик-ссылке — открыл URL и сразу внутри проекта, без регистрации, без пароля. Идентификация действий всё равно сохраняется: Maket понимает, кто ты, по тому, как ты зашёл.</w:t>
       </w:r>
     </w:p>
     <w:p>
@@ -2620,41 +2021,30 @@
       <w:r>
         <w:rPr>
           <w:rFonts w:ascii="Arial" w:cs="Arial" w:eastAsia="Arial" w:hAnsi="Arial"/>
-          <w:b/>
-          <w:bCs/>
-          <w:color w:val="1f1f1f"/>
-          <w:sz w:val="22"/>
-          <w:szCs w:val="22"/>
-        </w:rPr>
-        <w:t xml:space="preserve">Экран для свободного контента. </w:t>
-      </w:r>
-      <w:r>
-        <w:rPr>
-          <w:rFonts w:ascii="Arial" w:cs="Arial" w:eastAsia="Arial" w:hAnsi="Arial"/>
-          <w:color w:val="1f1f1f"/>
-          <w:sz w:val="22"/>
-          <w:szCs w:val="22"/>
-        </w:rPr>
-        <w:t xml:space="preserve">Лук, соцсети, моушн. Здесь не нужна привязка к SKU — нужен гибкий контейнер, который держит группу кадров вместе, с общими комментариями и статусом.</w:t>
-      </w:r>
-    </w:p>
-    <w:p>
-      <w:pPr>
-        <w:spacing w:after="120" w:line="300"/>
-        <w:jc w:val="left"/>
-      </w:pPr>
-      <w:r>
-        <w:rPr>
-          <w:rFonts w:ascii="Arial" w:cs="Arial" w:eastAsia="Arial" w:hAnsi="Arial"/>
-          <w:b w:val="false"/>
-          <w:bCs w:val="false"/>
-          <w:i w:val="false"/>
-          <w:iCs w:val="false"/>
-          <w:color w:val="1f1f1f"/>
-          <w:sz w:val="22"/>
-          <w:szCs w:val="22"/>
-        </w:rPr>
-        <w:t xml:space="preserve">У контейнера есть: категория, слоты под конкретные ракурсы, привязка к артикулу или к образу, комментарии и итерации по каждому кадру внутри, статус на пайплайне. Когда я загружаю 2000 превью после съёмки, я их не «сортирую». Я раскладываю по контейнерам так, как вижу логику. Клиент потом смотрит на готовые контейнеры, а не на 2000 файлов. Это разница между библиотекой и витриной.</w:t>
+          <w:color w:val="1f1f1f"/>
+          <w:sz w:val="22"/>
+          <w:szCs w:val="22"/>
+        </w:rPr>
+        <w:t xml:space="preserve">С регистрацией — если так удобнее (например, несколько проектов одновременно и хочется видеть их в одном месте).</w:t>
+      </w:r>
+    </w:p>
+    <w:p>
+      <w:pPr>
+        <w:spacing w:after="120" w:line="300"/>
+        <w:jc w:val="left"/>
+      </w:pPr>
+      <w:r>
+        <w:rPr>
+          <w:rFonts w:ascii="Arial" w:cs="Arial" w:eastAsia="Arial" w:hAnsi="Arial"/>
+          <w:b w:val="false"/>
+          <w:bCs w:val="false"/>
+          <w:i w:val="false"/>
+          <w:iCs w:val="false"/>
+          <w:color w:val="1f1f1f"/>
+          <w:sz w:val="22"/>
+          <w:szCs w:val="22"/>
+        </w:rPr>
+        <w:t xml:space="preserve">Обязательна регистрация только для одного — владельца проекта. Им может быть фотограф, продюсер, студия или сам клиент — это не важно, важна роль: кто создаёт проект и отвечает за его существование. Минимальный порог входа для всех остальных — один клик по ссылке из письма.</w:t>
       </w:r>
     </w:p>
     <w:p>
@@ -2671,6 +2061,185 @@
           <w:sz w:val="26"/>
           <w:szCs w:val="26"/>
         </w:rPr>
+        <w:t xml:space="preserve">3.3. Контейнер — центр продукта</w:t>
+      </w:r>
+    </w:p>
+    <w:p>
+      <w:pPr>
+        <w:spacing w:after="120" w:line="300"/>
+        <w:jc w:val="left"/>
+      </w:pPr>
+      <w:r>
+        <w:rPr>
+          <w:rFonts w:ascii="Arial" w:cs="Arial" w:eastAsia="Arial" w:hAnsi="Arial"/>
+          <w:b w:val="false"/>
+          <w:bCs w:val="false"/>
+          <w:i w:val="false"/>
+          <w:iCs w:val="false"/>
+          <w:color w:val="1f1f1f"/>
+          <w:sz w:val="22"/>
+          <w:szCs w:val="22"/>
+        </w:rPr>
+        <w:t xml:space="preserve">Вокруг одного объекта крутится буквально весь продукт. Maket называет его контейнером. В e-commerce контейнер — это карточка товара. Для соцсетей — группа кадров одного поста. Для моушн-проекта — раскадровка. Сам объект один и тот же: запланированная единица контента с нужными ракурсами, комментариями и статусом на пайплайне.</w:t>
+      </w:r>
+    </w:p>
+    <w:p>
+      <w:pPr>
+        <w:spacing w:after="120" w:line="300"/>
+        <w:jc w:val="left"/>
+      </w:pPr>
+      <w:r>
+        <w:rPr>
+          <w:rFonts w:ascii="Arial" w:cs="Arial" w:eastAsia="Arial" w:hAnsi="Arial"/>
+          <w:b w:val="false"/>
+          <w:bCs w:val="false"/>
+          <w:i w:val="false"/>
+          <w:iCs w:val="false"/>
+          <w:color w:val="1f1f1f"/>
+          <w:sz w:val="22"/>
+          <w:szCs w:val="22"/>
+        </w:rPr>
+        <w:t xml:space="preserve">Контейнер реализован двумя интерфейсами, потому что логика работы с ними разная:</w:t>
+      </w:r>
+    </w:p>
+    <w:p>
+      <w:pPr>
+        <w:pStyle w:val="ListParagraph"/>
+        <w:numPr>
+          <w:ilvl w:val="0"/>
+          <w:numId w:val="2"/>
+        </w:numPr>
+        <w:spacing w:after="80" w:line="300"/>
+      </w:pPr>
+      <w:r>
+        <w:rPr>
+          <w:rFonts w:ascii="Arial" w:cs="Arial" w:eastAsia="Arial" w:hAnsi="Arial"/>
+          <w:b/>
+          <w:bCs/>
+          <w:color w:val="1f1f1f"/>
+          <w:sz w:val="22"/>
+          <w:szCs w:val="22"/>
+        </w:rPr>
+        <w:t xml:space="preserve">Экран для e-commerce. </w:t>
+      </w:r>
+      <w:r>
+        <w:rPr>
+          <w:rFonts w:ascii="Arial" w:cs="Arial" w:eastAsia="Arial" w:hAnsi="Arial"/>
+          <w:color w:val="1f1f1f"/>
+          <w:sz w:val="22"/>
+          <w:szCs w:val="22"/>
+        </w:rPr>
+        <w:t xml:space="preserve">Карточка товара привязана к артикулу, заданы слоты под ракурсы (общий, деталь, лайфстайл), понятная таблица «что готово, что нет».</w:t>
+      </w:r>
+    </w:p>
+    <w:p>
+      <w:pPr>
+        <w:pStyle w:val="ListParagraph"/>
+        <w:numPr>
+          <w:ilvl w:val="0"/>
+          <w:numId w:val="2"/>
+        </w:numPr>
+        <w:spacing w:after="80" w:line="300"/>
+      </w:pPr>
+      <w:r>
+        <w:rPr>
+          <w:rFonts w:ascii="Arial" w:cs="Arial" w:eastAsia="Arial" w:hAnsi="Arial"/>
+          <w:b/>
+          <w:bCs/>
+          <w:color w:val="1f1f1f"/>
+          <w:sz w:val="22"/>
+          <w:szCs w:val="22"/>
+        </w:rPr>
+        <w:t xml:space="preserve">Экран для свободного контента. </w:t>
+      </w:r>
+      <w:r>
+        <w:rPr>
+          <w:rFonts w:ascii="Arial" w:cs="Arial" w:eastAsia="Arial" w:hAnsi="Arial"/>
+          <w:color w:val="1f1f1f"/>
+          <w:sz w:val="22"/>
+          <w:szCs w:val="22"/>
+        </w:rPr>
+        <w:t xml:space="preserve">Соцсети, моушн, lifestyle-контент. Привязка к SKU не нужна — нужен гибкий контейнер, который держит группу кадров вместе, с общими комментариями и статусом.</w:t>
+      </w:r>
+    </w:p>
+    <w:p>
+      <w:pPr>
+        <w:spacing w:after="120" w:line="300"/>
+        <w:jc w:val="left"/>
+      </w:pPr>
+      <w:r>
+        <w:rPr>
+          <w:rFonts w:ascii="Arial" w:cs="Arial" w:eastAsia="Arial" w:hAnsi="Arial"/>
+          <w:b w:val="false"/>
+          <w:bCs w:val="false"/>
+          <w:i w:val="false"/>
+          <w:iCs w:val="false"/>
+          <w:color w:val="1f1f1f"/>
+          <w:sz w:val="22"/>
+          <w:szCs w:val="22"/>
+        </w:rPr>
+        <w:t xml:space="preserve">В ближайших планах — третий тип контейнера: образ. Один образ может состоять из нескольких артикулов одновременно (например, платье + сумка + аксессуар), и Maket должен уметь держать эту связь — кадры образа одновременно принадлежат нескольким артикулам, и команда видит это в обоих направлениях.</w:t>
+      </w:r>
+    </w:p>
+    <w:p>
+      <w:pPr>
+        <w:spacing w:after="120" w:line="300"/>
+        <w:jc w:val="left"/>
+      </w:pPr>
+      <w:r>
+        <w:rPr>
+          <w:rFonts w:ascii="Arial" w:cs="Arial" w:eastAsia="Arial" w:hAnsi="Arial"/>
+          <w:b w:val="false"/>
+          <w:bCs w:val="false"/>
+          <w:i w:val="false"/>
+          <w:iCs w:val="false"/>
+          <w:color w:val="1f1f1f"/>
+          <w:sz w:val="22"/>
+          <w:szCs w:val="22"/>
+        </w:rPr>
+        <w:t xml:space="preserve">Ключевая разница, которую даёт контейнер, — это разница между библиотекой и витриной. Команда может отдать клиенту 2000 исходников в папке. А может отдать 600 кадров, разложенных по контейнерам, с фильтрами: что отобрано в карточку товара, что для соцсетей, что для публикаций, что помечено как технический кадр. Клиент листает не файлы — он листает готовый отбор команды в структуре, и при этом может заходить внутрь и смотреть, что не попало в отбор, зачем это снималось, какое количество звёзд стояло на площадке.</w:t>
+      </w:r>
+    </w:p>
+    <w:p>
+      <w:pPr>
+        <w:spacing w:after="120" w:line="300"/>
+        <w:jc w:val="left"/>
+      </w:pPr>
+      <w:r>
+        <w:rPr>
+          <w:rFonts w:ascii="Arial" w:cs="Arial" w:eastAsia="Arial" w:hAnsi="Arial"/>
+          <w:b/>
+          <w:bCs/>
+          <w:color w:val="1f1f1f"/>
+          <w:sz w:val="22"/>
+          <w:szCs w:val="22"/>
+        </w:rPr>
+        <w:t xml:space="preserve">Отдельная категория — технические кадры. </w:t>
+      </w:r>
+      <w:r>
+        <w:rPr>
+          <w:rFonts w:ascii="Arial" w:cs="Arial" w:eastAsia="Arial" w:hAnsi="Arial"/>
+          <w:color w:val="1f1f1f"/>
+          <w:sz w:val="22"/>
+          <w:szCs w:val="22"/>
+        </w:rPr>
+        <w:t xml:space="preserve">Это кадры, которые нужны команде для работы (эталоны света, снимки лейбла, технические ракурсы для ретушёра), но не идут в финальный отбор. Они складываются в отдельный контейнер, не засчитываются в метрики количества кадров, которые прошли все этапы, и не попадают в биллинг. Это важно: клиент не платит за кадры, которые снимались для технических целей.</w:t>
+      </w:r>
+    </w:p>
+    <w:p>
+      <w:pPr>
+        <w:pStyle w:val="Heading2"/>
+        <w:spacing w:after="180" w:before="280"/>
+      </w:pPr>
+      <w:r>
+        <w:rPr>
+          <w:rFonts w:ascii="Arial" w:cs="Arial" w:eastAsia="Arial" w:hAnsi="Arial"/>
+          <w:b/>
+          <w:bCs/>
+          <w:color w:val="111111"/>
+          <w:sz w:val="26"/>
+          <w:szCs w:val="26"/>
+        </w:rPr>
         <w:t xml:space="preserve">3.4. Три фазы проекта: где мы сейчас</w:t>
       </w:r>
     </w:p>
@@ -2690,7 +2259,7 @@
           <w:sz w:val="22"/>
           <w:szCs w:val="22"/>
         </w:rPr>
-        <w:t xml:space="preserve">У любой коммерческой съёмки три фазы — до, во время и после. Сегодня Maket CP целиком закрывает «после». Именно там живёт 70% боли. Но я планомерно расширяю охват.</w:t>
+        <w:t xml:space="preserve">У любой коммерческой съёмки три фазы — до, во время и после. Сегодня Maket CP целиком закрывает «после». Именно там живёт больша́я часть боли. Охват двух других фаз расширяется постепенно — и ниже честная карта того, что уже есть и что нужно не путать с будущим.</w:t>
       </w:r>
     </w:p>
     <w:tbl>
@@ -2898,7 +2467,7 @@
                 <w:sz w:val="20"/>
                 <w:szCs w:val="20"/>
               </w:rPr>
-              <w:t xml:space="preserve">Частично. Шаблоны контейнеров можно собрать до съёмки — клиент заранее видит план работы.</w:t>
+              <w:t xml:space="preserve">Минимальное. Если заранее собраны шаблоны контейнеров, их можно использовать на съёмке для сверки с брифом. Полноценная работа с брифом — в планах.</w:t>
             </w:r>
           </w:p>
         </w:tc>
@@ -2993,7 +2562,7 @@
                 <w:sz w:val="20"/>
                 <w:szCs w:val="20"/>
               </w:rPr>
-              <w:t xml:space="preserve">Частично. Превью подгружаются из Capture One через встроенный Rate Setter, удалённый клиент видит их почти в реальном времени.</w:t>
+              <w:t xml:space="preserve">Частично. Через встроенный Rate Setter превью и звёзды из Capture One уходят в облако; удалённый клиент при желании может следить за съёмкой.</w:t>
             </w:r>
           </w:p>
         </w:tc>
@@ -3127,7 +2696,7 @@
           <w:sz w:val="22"/>
           <w:szCs w:val="22"/>
         </w:rPr>
-        <w:t xml:space="preserve">Каждое действие в Maket CP сохраняется как событие с автором и временем. Это не журнал для аудита. Это живая ткань проекта, которую можно потом развернуть.</w:t>
+        <w:t xml:space="preserve">Каждое действие в Maket сохраняется как событие с автором и временем. Это не журнал для аудита. Это живая ткань проекта, которую можно потом развернуть.</w:t>
       </w:r>
     </w:p>
     <w:p>
@@ -3203,7 +2772,7 @@
           <w:sz w:val="22"/>
           <w:szCs w:val="22"/>
         </w:rPr>
-        <w:t xml:space="preserve">Ретушёр загрузил версию — событие.</w:t>
+        <w:t xml:space="preserve">Команда загрузила версию ретуши — событие.</w:t>
       </w:r>
     </w:p>
     <w:p>
@@ -3241,7 +2810,7 @@
           <w:sz w:val="22"/>
           <w:szCs w:val="22"/>
         </w:rPr>
-        <w:t xml:space="preserve">У каждого такого события есть подпись: кто именно это сделал и в какой момент. Клиент зашёл по магик-ссылке — в истории это не «кто-то», это конкретный человек, и Maket CP это понимает. Именно поэтому история не разваливается, когда через две недели встаёт вопрос «кто это правил» или «это моя правка или не моя».</w:t>
+        <w:t xml:space="preserve">У каждого такого события есть подпись: кто именно это сделал и в какой момент. Клиент зашёл по магик-ссылке — в истории это не «кто-то», это конкретный человек, и Maket это понимает. Именно поэтому история не разваливается, когда через две недели встаёт вопрос «кто это правил» или «это моя правка или не моя».</w:t>
       </w:r>
     </w:p>
     <w:p>
@@ -3277,7 +2846,7 @@
           <w:sz w:val="22"/>
           <w:szCs w:val="22"/>
         </w:rPr>
-        <w:t xml:space="preserve">Из этих событий собираются два вида. Первый — компактный дашборд с цифрами по этапам: «преотбор — 140 из 140, клиентский отбор — 80 одобрено, 60 на доработке, ретушь — 30, согласовано — 15». На него достаточно взглянуть, чтобы понять, где проект. Второй — детальный маршрут, как git-история: какие кадры пошли основным потоком, какие догнали позже после доработки, где случились слияния и возвраты. Этого клиент обычно никогда не видит. У меня видит.</w:t>
+        <w:t xml:space="preserve">Из этих событий собираются два вида. Первый — компактный дашборд с цифрами по этапам: «преотбор — 140 из 140, клиентский отбор — 80 одобрено, 60 на доработке, ретушь — 30, согласовано — 15». На него достаточно взглянуть, чтобы понять, где проект. Второй — детальный маршрут, как git-история: какие кадры пошли основным потоком, какие догнали позже после доработки, где случились слияния и возвраты. В обычной работе клиент такого среза почти никогда не видит. В Maket — видит.</w:t>
       </w:r>
     </w:p>
     <w:p>
@@ -3313,26 +2882,26 @@
           <w:sz w:val="22"/>
           <w:szCs w:val="22"/>
         </w:rPr>
-        <w:t xml:space="preserve">У Maket CP уже работает мобильный клиент, и это одна из самых приятных неочевидных вещей, которую я слышу от брендов. Лента карточек, свайп-карусель по кадрам внутри одной карточки, общий комментарий в конце, кнопки «Согласовать» / «Вернуть».</w:t>
-      </w:r>
-    </w:p>
-    <w:p>
-      <w:pPr>
-        <w:spacing w:after="120" w:line="300"/>
-        <w:jc w:val="left"/>
-      </w:pPr>
-      <w:r>
-        <w:rPr>
-          <w:rFonts w:ascii="Arial" w:cs="Arial" w:eastAsia="Arial" w:hAnsi="Arial"/>
-          <w:b w:val="false"/>
-          <w:bCs w:val="false"/>
-          <w:i w:val="false"/>
-          <w:iCs w:val="false"/>
-          <w:color w:val="1f1f1f"/>
-          <w:sz w:val="22"/>
-          <w:szCs w:val="22"/>
-        </w:rPr>
-        <w:t xml:space="preserve">На практике это выглядит так: креативный директор бренда едет в такси после встречи, открывает ссылку, пролистывает пять карточек, оставляет общий комментарий к каждой и тут же согласовывает всю партию. Не открывает ноутбук, не пишет в чат «пришлите ещё раз, я потерял». Через минуту у меня на экране уже виден результат — и я дальше могу двигать следующую партию.</w:t>
+        <w:t xml:space="preserve">У Maket уже работает мобильный клиент — одна из неочевидных вещей, которую клиенты отмечают в первую очередь. Лента карточек, свайп-карусель по кадрам внутри одной карточки, общий комментарий в конце, кнопки «Согласовать» / «Вернуть».</w:t>
+      </w:r>
+    </w:p>
+    <w:p>
+      <w:pPr>
+        <w:spacing w:after="120" w:line="300"/>
+        <w:jc w:val="left"/>
+      </w:pPr>
+      <w:r>
+        <w:rPr>
+          <w:rFonts w:ascii="Arial" w:cs="Arial" w:eastAsia="Arial" w:hAnsi="Arial"/>
+          <w:b w:val="false"/>
+          <w:bCs w:val="false"/>
+          <w:i w:val="false"/>
+          <w:iCs w:val="false"/>
+          <w:color w:val="1f1f1f"/>
+          <w:sz w:val="22"/>
+          <w:szCs w:val="22"/>
+        </w:rPr>
+        <w:t xml:space="preserve">На практике это выглядит так: креативный директор на стороне клиента едет в такси после встречи, открывает ссылку, пролистывает пять карточек, оставляет общий комментарий к каждой и тут же согласовывает всю партию. Не открывает ноутбук, не пишет в чат «пришлите ещё раз, я потерял». Через минуту у команды на экране уже виден результат — и следующую партию можно двигать дальше.</w:t>
       </w:r>
     </w:p>
     <w:p>
@@ -3387,7 +2956,7 @@
           <w:sz w:val="22"/>
           <w:szCs w:val="22"/>
         </w:rPr>
-        <w:t xml:space="preserve">Это убирает проблему «всё ждёт один кадр». Готовые партии идут дальше, спорные остаются на доработке — и ретушёр уже может начать работу по согласованной части, пока команда разбирается с пятью проблемными.</w:t>
+        <w:t xml:space="preserve">Это убирает проблему «всё ждёт один кадр». Готовые партии идут дальше, спорные остаются на доработке — и работа по согласованной части может начинаться сразу, пока команда разбирается с несколькими проблемными.</w:t>
       </w:r>
     </w:p>
     <w:p>
@@ -3447,7 +3016,7 @@
           <w:sz w:val="22"/>
           <w:szCs w:val="22"/>
         </w:rPr>
-        <w:t xml:space="preserve">Maket CP уже работает на реальных коммерческих съёмках для брендов одежды и обуви. Ниже — несколько наблюдений из этих проектов и прямых цитат клиентов.</w:t>
+        <w:t xml:space="preserve">Maket CP уже работает на реальных коммерческих съёмках в категориях одежды и обуви. Ниже — несколько наблюдений из этих проектов и прямых цитат клиентов.</w:t>
       </w:r>
     </w:p>
     <w:p>
@@ -3483,26 +3052,26 @@
           <w:sz w:val="22"/>
           <w:szCs w:val="22"/>
         </w:rPr>
-        <w:t xml:space="preserve">Один из проектов — съёмка для креативного директора бренда, который работает «на интуиции». Бриф — коллаж референсов из Pinterest и голосовые. Задача: из 2400 кадров сделать 40 готовых для каталога. Обычно такое тянется месяц обсуждений в чате.</w:t>
-      </w:r>
-    </w:p>
-    <w:p>
-      <w:pPr>
-        <w:spacing w:after="120" w:line="300"/>
-        <w:jc w:val="left"/>
-      </w:pPr>
-      <w:r>
-        <w:rPr>
-          <w:rFonts w:ascii="Arial" w:cs="Arial" w:eastAsia="Arial" w:hAnsi="Arial"/>
-          <w:b w:val="false"/>
-          <w:bCs w:val="false"/>
-          <w:i w:val="false"/>
-          <w:iCs w:val="false"/>
-          <w:color w:val="1f1f1f"/>
-          <w:sz w:val="22"/>
-          <w:szCs w:val="22"/>
-        </w:rPr>
-        <w:t xml:space="preserve">Мы со стилистом разложили превью по десяти карточкам — по одной на образ. Я отправила клиенту ссылку. В ответ пришло:</w:t>
+        <w:t xml:space="preserve">Один из проектов — съёмка для креативного директора, работающего «на интуиции». Бриф — коллаж референсов из Pinterest и голосовые. Задача: из 2400 кадров сделать 40 готовых для каталога. Обычно такое тянется месяц обсуждений в чате.</w:t>
+      </w:r>
+    </w:p>
+    <w:p>
+      <w:pPr>
+        <w:spacing w:after="120" w:line="300"/>
+        <w:jc w:val="left"/>
+      </w:pPr>
+      <w:r>
+        <w:rPr>
+          <w:rFonts w:ascii="Arial" w:cs="Arial" w:eastAsia="Arial" w:hAnsi="Arial"/>
+          <w:b w:val="false"/>
+          <w:bCs w:val="false"/>
+          <w:i w:val="false"/>
+          <w:iCs w:val="false"/>
+          <w:color w:val="1f1f1f"/>
+          <w:sz w:val="22"/>
+          <w:szCs w:val="22"/>
+        </w:rPr>
+        <w:t xml:space="preserve">Команда разложила превью по десяти карточкам — по одной на образ. Клиенту отправили ссылку. В ответ пришло:</w:t>
       </w:r>
     </w:p>
     <w:p>
@@ -3550,7 +3119,7 @@
           <w:sz w:val="22"/>
           <w:szCs w:val="22"/>
         </w:rPr>
-        <w:t xml:space="preserve">Я эту реакцию уже видела у нескольких клиентов этого типа. Им не нужен ещё один канал коммуникации — у них и так с этим всё хорошо. Им нужен кто-то или что-то, кто разложит хаос за них. Карточка — это и есть результат этой работы, но в видимой форме. Клиент не просит «показать отбор» — он просит «разложить, чтобы стало понятно». Это другие слова про одно и то же.</w:t>
+        <w:t xml:space="preserve">Такая реакция повторяется у нескольких клиентов этого типа. Им не нужен ещё один канал коммуникации — у них и так с этим всё хорошо. Им нужен кто-то или что-то, кто разложит хаос за них. Карточка — это и есть результат этой работы, но в видимой форме. Клиент не просит «показать отбор» — он просит «разложить, чтобы стало понятно». Это другие слова про одно и то же.</w:t>
       </w:r>
     </w:p>
     <w:p>
@@ -3586,26 +3155,26 @@
           <w:sz w:val="22"/>
           <w:szCs w:val="22"/>
         </w:rPr>
-        <w:t xml:space="preserve">Другой проект — бренд обуви с подробным брифом. Клиент сам прислал 52 готовые карточки — по 8 кадров каждая. Всё структурировано, всё расписано.</w:t>
-      </w:r>
-    </w:p>
-    <w:p>
-      <w:pPr>
-        <w:spacing w:after="120" w:line="300"/>
-        <w:jc w:val="left"/>
-      </w:pPr>
-      <w:r>
-        <w:rPr>
-          <w:rFonts w:ascii="Arial" w:cs="Arial" w:eastAsia="Arial" w:hAnsi="Arial"/>
-          <w:b w:val="false"/>
-          <w:bCs w:val="false"/>
-          <w:i w:val="false"/>
-          <w:iCs w:val="false"/>
-          <w:color w:val="1f1f1f"/>
-          <w:sz w:val="22"/>
-          <w:szCs w:val="22"/>
-        </w:rPr>
-        <w:t xml:space="preserve">Здесь ценность совсем другая. Структура у клиента в голове уже есть — помогать её строить не нужно. Ему важно, чтобы эта структура не расползлась по чатам и папкам, а стала источником правды для всей команды. В Maket CP это само собой выходит: клиент заливает бриф, я вижу план, ретушёр видит комментарии. Все работают с одним и тем же объектом, никто не сверяется с «последней версией эксельки».</w:t>
+        <w:t xml:space="preserve">Другой проект — клиент в категории обуви с подробным брифом. Сам прислал 52 готовые карточки — по 8 кадров каждая. Всё структурировано, всё расписано.</w:t>
+      </w:r>
+    </w:p>
+    <w:p>
+      <w:pPr>
+        <w:spacing w:after="120" w:line="300"/>
+        <w:jc w:val="left"/>
+      </w:pPr>
+      <w:r>
+        <w:rPr>
+          <w:rFonts w:ascii="Arial" w:cs="Arial" w:eastAsia="Arial" w:hAnsi="Arial"/>
+          <w:b w:val="false"/>
+          <w:bCs w:val="false"/>
+          <w:i w:val="false"/>
+          <w:iCs w:val="false"/>
+          <w:color w:val="1f1f1f"/>
+          <w:sz w:val="22"/>
+          <w:szCs w:val="22"/>
+        </w:rPr>
+        <w:t xml:space="preserve">Здесь ценность совсем другая. Структура у клиента в голове уже есть — помогать её строить не нужно. Ему важно, чтобы эта структура не расползлась по чатам и папкам, а стала источником правды для всей команды. В Maket это выходит само собой: клиент заливает бриф, команда видит план, комментарии видны всем. Все работают с одним и тем же объектом, никто не сверяется с «последней версией эксельки».</w:t>
       </w:r>
     </w:p>
     <w:p>
@@ -3670,26 +3239,26 @@
           <w:sz w:val="22"/>
           <w:szCs w:val="22"/>
         </w:rPr>
-        <w:t xml:space="preserve">Вот эта фраза, по-моему, лучше всего описывает переход, который делает Maket CP. До него работа с фотографом для бренда — это обмен артефактами. «Пришли подборку». «Пришли финал». «Пришли адаптацию». Каждая пересылка — шанс что-то потерять.</w:t>
-      </w:r>
-    </w:p>
-    <w:p>
-      <w:pPr>
-        <w:spacing w:after="120" w:line="300"/>
-        <w:jc w:val="left"/>
-      </w:pPr>
-      <w:r>
-        <w:rPr>
-          <w:rFonts w:ascii="Arial" w:cs="Arial" w:eastAsia="Arial" w:hAnsi="Arial"/>
-          <w:b w:val="false"/>
-          <w:bCs w:val="false"/>
-          <w:i w:val="false"/>
-          <w:iCs w:val="false"/>
-          <w:color w:val="1f1f1f"/>
-          <w:sz w:val="22"/>
-          <w:szCs w:val="22"/>
-        </w:rPr>
-        <w:t xml:space="preserve">С Maket CP это не пересылки, а общее пространство. Я загружаю превью — клиент видит. Клиент согласовывает — я вижу. Никаких «давайте ещё раз уточним, какая версия актуальная».</w:t>
+        <w:t xml:space="preserve">Эта фраза, пожалуй, лучше всего описывает переход, который делает Maket. До него любая коммерческая съёмка — это обмен артефактами между командой и клиентом. «Пришли подборку». «Пришли финал». «Пришли адаптацию». Каждая пересылка — шанс что-то потерять.</w:t>
+      </w:r>
+    </w:p>
+    <w:p>
+      <w:pPr>
+        <w:spacing w:after="120" w:line="300"/>
+        <w:jc w:val="left"/>
+      </w:pPr>
+      <w:r>
+        <w:rPr>
+          <w:rFonts w:ascii="Arial" w:cs="Arial" w:eastAsia="Arial" w:hAnsi="Arial"/>
+          <w:b w:val="false"/>
+          <w:bCs w:val="false"/>
+          <w:i w:val="false"/>
+          <w:iCs w:val="false"/>
+          <w:color w:val="1f1f1f"/>
+          <w:sz w:val="22"/>
+          <w:szCs w:val="22"/>
+        </w:rPr>
+        <w:t xml:space="preserve">С Maket это не пересылки, а общее пространство. Команда загружает превью — клиент видит. Клиент согласовывает — команда видит. Никаких «давайте ещё раз уточним, какая версия актуальная».</w:t>
       </w:r>
     </w:p>
     <w:p>
@@ -3804,7 +3373,7 @@
           <w:sz w:val="22"/>
           <w:szCs w:val="22"/>
         </w:rPr>
-        <w:t xml:space="preserve">Тарифную модель я ещё настраиваю — это область, в которой я хочу, чтобы пилоты первых месяцев подсказали правильные ответы. Ниже — рабочая схема, по которой Maket CP работает сейчас.</w:t>
+        <w:t xml:space="preserve">Тарифная модель ещё настраивается — пилоты первых месяцев подскажут правильные ответы. Ниже — рабочая схема, по которой Maket работает сейчас.</w:t>
       </w:r>
     </w:p>
     <w:p>
@@ -3870,7 +3439,7 @@
           <w:sz w:val="22"/>
           <w:szCs w:val="22"/>
         </w:rPr>
-        <w:t xml:space="preserve">Платишь один раз при создании, работаешь сколько нужно. Отбор, ретушь, адаптация — всё в рамках этой суммы.</w:t>
+        <w:t xml:space="preserve">Оплачивается один раз при создании, проект живёт столько, сколько нужно. Отбор, ретушь, адаптация — всё в рамках этой суммы.</w:t>
       </w:r>
     </w:p>
     <w:p>
@@ -3900,7 +3469,7 @@
           <w:sz w:val="22"/>
           <w:szCs w:val="22"/>
         </w:rPr>
-        <w:t xml:space="preserve">Через три месяца проект уходит в архив. Продлить хранение ещё на три месяца — 100 рублей. Не продлеваешь — перед удалением выгружается один файл со всеми финалами.</w:t>
+        <w:t xml:space="preserve">Через три месяца проект уходит в архив. Продлить хранение ещё на три месяца — 100 рублей. Без продления — перед удалением выгружается один файл со всеми финалами.</w:t>
       </w:r>
     </w:p>
     <w:p>
@@ -3938,7 +3507,7 @@
           <w:sz w:val="22"/>
           <w:szCs w:val="22"/>
         </w:rPr>
-        <w:t xml:space="preserve">Порог входа низкий. Клиент тратит на пробу меньше, чем на бизнес-ланч.</w:t>
+        <w:t xml:space="preserve">Порог входа низкий. Проба стоит меньше, чем бизнес-ланч.</w:t>
       </w:r>
     </w:p>
     <w:p>
@@ -4012,7 +3581,7 @@
           <w:sz w:val="22"/>
           <w:szCs w:val="22"/>
         </w:rPr>
-        <w:t xml:space="preserve">Себестоимость одного проекта на моей стороне — от 5 до 40 рублей в зависимости от объёма превью, количества версий ретуши и того, сколько места съело облако. Маржа на платёж — 88–99%. Это значит, что мне не нужен венчурный раунд, чтобы расти. Мне достаточно аккуратного увеличения количества активных клиентов, и продукт сам себя содержит.</w:t>
+        <w:t xml:space="preserve">Себестоимость одного проекта для платформы — от 5 до 40 рублей в зависимости от объёма превью, количества версий ретуши и того, сколько места съело облако. Маржа на платёж — 88–99%. Это значит, что продукту не нужен венчурный раунд, чтобы расти. Достаточно аккуратного увеличения количества активных клиентов, и продукт содержит себя сам.</w:t>
       </w:r>
     </w:p>
     <w:p>
@@ -4048,45 +3617,45 @@
           <w:sz w:val="22"/>
           <w:szCs w:val="22"/>
         </w:rPr>
-        <w:t xml:space="preserve">Я думала над этим вопросом долго и наблюдала, как ведут себя первые пилоты. Ответ получился простой: платит тот, кто отвечает за процесс.</w:t>
-      </w:r>
-    </w:p>
-    <w:p>
-      <w:pPr>
-        <w:spacing w:after="120" w:line="300"/>
-        <w:jc w:val="left"/>
-      </w:pPr>
-      <w:r>
-        <w:rPr>
-          <w:rFonts w:ascii="Arial" w:cs="Arial" w:eastAsia="Arial" w:hAnsi="Arial"/>
-          <w:b w:val="false"/>
-          <w:bCs w:val="false"/>
-          <w:i w:val="false"/>
-          <w:iCs w:val="false"/>
-          <w:color w:val="1f1f1f"/>
-          <w:sz w:val="22"/>
-          <w:szCs w:val="22"/>
-        </w:rPr>
-        <w:t xml:space="preserve">Чаще всего это фотограф или продакшен-студия. Они приходят к бренду уже с инструментом и предлагают прозрачность как часть услуги. Бренд не платит отдельно — он получает доступ как участник проекта, и для него это просто «у них так работает».</w:t>
-      </w:r>
-    </w:p>
-    <w:p>
-      <w:pPr>
-        <w:spacing w:after="120" w:line="300"/>
-        <w:jc w:val="left"/>
-      </w:pPr>
-      <w:r>
-        <w:rPr>
-          <w:rFonts w:ascii="Arial" w:cs="Arial" w:eastAsia="Arial" w:hAnsi="Arial"/>
-          <w:b w:val="false"/>
-          <w:bCs w:val="false"/>
-          <w:i w:val="false"/>
-          <w:iCs w:val="false"/>
-          <w:color w:val="1f1f1f"/>
-          <w:sz w:val="22"/>
-          <w:szCs w:val="22"/>
-        </w:rPr>
-        <w:t xml:space="preserve">Обратная схема тоже бывает: крупный бренд централизованно закупает пакет, раздаёт ссылки своим фотографам и получает единое пространство для всех своих съёмок. Эта модель особенно хорошо работает для брендов с регулярным потоком проектов — и здесь же логично появляется следующий шаг, который я планирую на конец года: бренд-подписка с сквозным взглядом на артикулы между съёмками (подробнее в главе VII).</w:t>
+        <w:t xml:space="preserve">Этот вопрос продумывался долго, наблюдения за первыми пилотами дали простой ответ: платит тот, кто отвечает за процесс.</w:t>
+      </w:r>
+    </w:p>
+    <w:p>
+      <w:pPr>
+        <w:spacing w:after="120" w:line="300"/>
+        <w:jc w:val="left"/>
+      </w:pPr>
+      <w:r>
+        <w:rPr>
+          <w:rFonts w:ascii="Arial" w:cs="Arial" w:eastAsia="Arial" w:hAnsi="Arial"/>
+          <w:b w:val="false"/>
+          <w:bCs w:val="false"/>
+          <w:i w:val="false"/>
+          <w:iCs w:val="false"/>
+          <w:color w:val="1f1f1f"/>
+          <w:sz w:val="22"/>
+          <w:szCs w:val="22"/>
+        </w:rPr>
+        <w:t xml:space="preserve">Чаще всего это фотограф или продакшен-студия. Они приходят к клиенту уже с инструментом и предлагают прозрачность как часть услуги. Клиент не платит отдельно — получает доступ как участник проекта, и для него это просто «у них так работает».</w:t>
+      </w:r>
+    </w:p>
+    <w:p>
+      <w:pPr>
+        <w:spacing w:after="120" w:line="300"/>
+        <w:jc w:val="left"/>
+      </w:pPr>
+      <w:r>
+        <w:rPr>
+          <w:rFonts w:ascii="Arial" w:cs="Arial" w:eastAsia="Arial" w:hAnsi="Arial"/>
+          <w:b w:val="false"/>
+          <w:bCs w:val="false"/>
+          <w:i w:val="false"/>
+          <w:iCs w:val="false"/>
+          <w:color w:val="1f1f1f"/>
+          <w:sz w:val="22"/>
+          <w:szCs w:val="22"/>
+        </w:rPr>
+        <w:t xml:space="preserve">Обратная схема тоже бывает: крупный бренд централизованно закупает пакет, раздаёт ссылки своим продакшенам и получает единое пространство для всех своих съёмок. Эта модель особенно хорошо работает для брендов с регулярным потоком проектов — и здесь же логично появляется следующий шаг, запланированный на конец года: бренд-подписка со сквозным взглядом на артикулы между съёмками (подробнее в главе VII).</w:t>
       </w:r>
     </w:p>
     <w:p>
@@ -4127,7 +3696,7 @@
           <w:sz w:val="22"/>
           <w:szCs w:val="22"/>
         </w:rPr>
-        <w:t xml:space="preserve">Этот вопрос мне задаёт каждый второй технический директор. Отвечаю прямо: ни облако, ни таск-трекер, ни DAM не решают ту задачу, которую решаю я. Они все решают соседние. Ниже — на каком именно расстоянии.</w:t>
+        <w:t xml:space="preserve">Этот вопрос звучит от каждого второго технического директора. Ответ прямой: ни облако, ни таск-трекер, ни DAM не решают ту задачу, которую решает Maket. Они решают соседние. Ниже — на каком именно расстоянии.</w:t>
       </w:r>
     </w:p>
     <w:p>
@@ -4163,7 +3732,7 @@
           <w:sz w:val="22"/>
           <w:szCs w:val="22"/>
         </w:rPr>
-        <w:t xml:space="preserve">DAM вроде Bynder, Canto, Brandfolder — это хранилище финальных ассетов с тегами и доступами. Бренд заливает туда готовые картинки, команда маркетинга их берёт. DAM начинается там, где Maket CP заканчивается — когда фото уже готово, отретушировано и разложено по каналам.</w:t>
+        <w:t xml:space="preserve">DAM вроде Bynder, Canto, Brandfolder — хранилище финальных ассетов с тегами и доступами. Компания заливает туда готовые картинки, команда маркетинга их берёт. DAM начинается там, где Maket заканчивается — когда фото уже готово, отретушировано и разложено по каналам.</w:t>
       </w:r>
     </w:p>
     <w:tbl>
@@ -4405,7 +3974,7 @@
                 <w:sz w:val="21"/>
                 <w:szCs w:val="21"/>
               </w:rPr>
-              <w:t xml:space="preserve">Только внутренняя команда бренда.</w:t>
+              <w:t xml:space="preserve">Только внутренняя команда клиента.</w:t>
             </w:r>
           </w:p>
         </w:tc>
@@ -4436,7 +4005,7 @@
                 <w:sz w:val="21"/>
                 <w:szCs w:val="21"/>
               </w:rPr>
-              <w:t xml:space="preserve">Фотограф, клиент, ретушёр — в одном пространстве.</w:t>
+              <w:t xml:space="preserve">Команда и клиент — в одном пространстве.</w:t>
             </w:r>
           </w:p>
         </w:tc>
@@ -4539,7 +4108,7 @@
           <w:sz w:val="22"/>
           <w:szCs w:val="22"/>
         </w:rPr>
-        <w:t xml:space="preserve">Trello, Asana, Notion — отличные штуки, и я пыталась вести через них проекты. Проблема одна: они требуют, чтобы команда вручную дублировала реальную работу. Перенеси карточку. Отметь статус. Приложи файл. В командах, где культура таск-менеджмента уже в крови, это работает. В съёмочных — нет. Фотограф бросает таск-трекер после второго проекта, потому что заполнять его некогда.</w:t>
+        <w:t xml:space="preserve">Trello, Asana, Notion — отличные штуки, и через них тоже пытались вести съёмочные проекты. Проблема одна: они требуют, чтобы команда вручную дублировала реальную работу. Перенеси карточку. Отметь статус. Приложи файл. В командах, где культура таск-менеджмента уже в крови, это работает. В съёмочных — нет. Таск-трекер бросают после второго проекта, потому что заполнять его некогда.</w:t>
       </w:r>
     </w:p>
     <w:tbl>
@@ -4934,7 +4503,7 @@
           <w:sz w:val="22"/>
           <w:szCs w:val="22"/>
         </w:rPr>
-        <w:t xml:space="preserve">Maket CP не заменяет облако. Превью у меня лежат в том же Supabase Storage. Я просто добавляю поверх файлов слой смысла: этап, решение, комментарий, итерация. Файл остаётся файлом, но теперь вокруг него есть контекст.</w:t>
+        <w:t xml:space="preserve">Maket не заменяет облако. Превью лежат в том же Supabase Storage. Maket просто добавляет поверх файлов слой смысла: этап, решение, комментарий, итерация. Файл остаётся файлом, но теперь вокруг него есть контекст.</w:t>
       </w:r>
     </w:p>
     <w:p>
@@ -4989,7 +4558,7 @@
           <w:sz w:val="22"/>
           <w:szCs w:val="22"/>
         </w:rPr>
-        <w:t xml:space="preserve">Между съёмкой и публикацией живёт тот самый процесс — нелинейный, многоэтапный, с итерациями и возвратами, с мёртвыми ветками и параллельными задачами. И он почти всегда обслуживается устной памятью продюсера и перепиской в мессенджере. Maket CP делает именно этот слой видимым — и раздаёт эту видимость всем участникам одновременно.</w:t>
+        <w:t xml:space="preserve">Между съёмкой и публикацией живёт тот самый процесс — нелинейный, многоэтапный, с итерациями и возвратами, с мёртвыми ветками и параллельными задачами. И он почти всегда обслуживается устной памятью продюсера и перепиской в мессенджере. Maket делает именно этот слой видимым — и раздаёт эту видимость всем участникам одновременно.</w:t>
       </w:r>
     </w:p>
     <w:p>
@@ -5011,26 +4580,26 @@
           <w:sz w:val="32"/>
           <w:szCs w:val="32"/>
         </w:rPr>
-        <w:t xml:space="preserve">Часть VII. Куда я веду Maket CP дальше</w:t>
-      </w:r>
-    </w:p>
-    <w:p>
-      <w:pPr>
-        <w:spacing w:after="120" w:line="300"/>
-        <w:jc w:val="left"/>
-      </w:pPr>
-      <w:r>
-        <w:rPr>
-          <w:rFonts w:ascii="Arial" w:cs="Arial" w:eastAsia="Arial" w:hAnsi="Arial"/>
-          <w:b w:val="false"/>
-          <w:bCs w:val="false"/>
-          <w:i w:val="false"/>
-          <w:iCs w:val="false"/>
-          <w:color w:val="1f1f1f"/>
-          <w:sz w:val="22"/>
-          <w:szCs w:val="22"/>
-        </w:rPr>
-        <w:t xml:space="preserve">Продукт растёт слоями, а не большими скачками. MVP запустился в апреле 2026 и закрывает полный цикл постпродакшна. Ниже — что планирую дальше.</w:t>
+        <w:t xml:space="preserve">Часть VII. Куда Maket идёт дальше</w:t>
+      </w:r>
+    </w:p>
+    <w:p>
+      <w:pPr>
+        <w:spacing w:after="120" w:line="300"/>
+        <w:jc w:val="left"/>
+      </w:pPr>
+      <w:r>
+        <w:rPr>
+          <w:rFonts w:ascii="Arial" w:cs="Arial" w:eastAsia="Arial" w:hAnsi="Arial"/>
+          <w:b w:val="false"/>
+          <w:bCs w:val="false"/>
+          <w:i w:val="false"/>
+          <w:iCs w:val="false"/>
+          <w:color w:val="1f1f1f"/>
+          <w:sz w:val="22"/>
+          <w:szCs w:val="22"/>
+        </w:rPr>
+        <w:t xml:space="preserve">Продукт растёт слоями, а не большими скачками. MVP запустился в апреле 2026 и закрывает полный цикл постпродакшна. Ниже — что идёт дальше.</w:t>
       </w:r>
     </w:p>
     <w:p>
@@ -5047,7 +4616,7 @@
           <w:sz w:val="26"/>
           <w:szCs w:val="26"/>
         </w:rPr>
-        <w:t xml:space="preserve">7.1. II квартал 2026 — стабилизируем MVP</w:t>
+        <w:t xml:space="preserve">7.1. II квартал 2026 — стабилизация MVP</w:t>
       </w:r>
     </w:p>
     <w:p>
@@ -5159,7 +4728,7 @@
           <w:sz w:val="22"/>
           <w:szCs w:val="22"/>
         </w:rPr>
-        <w:t xml:space="preserve">Шаблоны контейнеров в препродакшне. Клиент или продюсер собирает структуру до съёмки, заранее видит план работы.</w:t>
+        <w:t xml:space="preserve">Шаблоны контейнеров в препродакшне. Клиент или продюсер собирает структуру до съёмки, заранее виден план работы.</w:t>
       </w:r>
     </w:p>
     <w:p>
@@ -5197,7 +4766,7 @@
           <w:sz w:val="22"/>
           <w:szCs w:val="22"/>
         </w:rPr>
-        <w:t xml:space="preserve">Сторадж с реальными фотографиями на каждом этапе. Сейчас у нас превью и финалы, но полные версии между этапами живут на гугл-дисках. Следующий шаг — чтобы Maket CP хранил полный файл на каждой промежуточной стадии, и «пришлите ещё раз» перестало существовать как запрос.</w:t>
+        <w:t xml:space="preserve">Сторадж с реальными фотографиями на каждом этапе. Сейчас есть превью и финалы, но полные версии между этапами живут на гугл-дисках. Следующий шаг — чтобы Maket хранил полный файл на каждой промежуточной стадии, и «пришлите ещё раз» перестало существовать как запрос.</w:t>
       </w:r>
     </w:p>
     <w:p>
@@ -5216,7 +4785,7 @@
           <w:sz w:val="22"/>
           <w:szCs w:val="22"/>
         </w:rPr>
-        <w:t xml:space="preserve">Отдельной платной доработкой под конкретный бренд можем делать тесные интеграции с корпоративными системами — 1С, МойСклад, собственные PIM. Это уже не универсальная фича, а проект под задачу.</w:t>
+        <w:t xml:space="preserve">Отдельной платной доработкой под конкретного клиента возможны тесные интеграции с корпоративными системами — 1С, МойСклад, собственные PIM. Это уже не универсальная фича, а проект под задачу.</w:t>
       </w:r>
     </w:p>
     <w:p>
@@ -5290,7 +4859,7 @@
           <w:sz w:val="22"/>
           <w:szCs w:val="22"/>
         </w:rPr>
-        <w:t xml:space="preserve">Бренд-кабинет — единый URL для команды клиента (CD, арт-директор, бренд-менеджер), в котором видны все съёмки, все артикулы, вся история, независимо от того, какой фотограф снимал. Основа для бренд-подписки: годовой пакет вместо поштучной оплаты.</w:t>
+        <w:t xml:space="preserve">Бренд-кабинет — единый URL для команды на стороне клиента (CD, арт-директор, бренд-менеджер), в котором видны все съёмки, все артикулы, вся история, независимо от того, какая команда снимала. Основа для бренд-подписки: годовой пакет вместо поштучной оплаты.</w:t>
       </w:r>
     </w:p>
     <w:p>
@@ -5307,26 +4876,26 @@
           <w:sz w:val="26"/>
           <w:szCs w:val="26"/>
         </w:rPr>
-        <w:t xml:space="preserve">7.4. Что не поменяется, что бы я ни добавляла</w:t>
-      </w:r>
-    </w:p>
-    <w:p>
-      <w:pPr>
-        <w:spacing w:after="120" w:line="300"/>
-        <w:jc w:val="left"/>
-      </w:pPr>
-      <w:r>
-        <w:rPr>
-          <w:rFonts w:ascii="Arial" w:cs="Arial" w:eastAsia="Arial" w:hAnsi="Arial"/>
-          <w:b w:val="false"/>
-          <w:bCs w:val="false"/>
-          <w:i w:val="false"/>
-          <w:iCs w:val="false"/>
-          <w:color w:val="1f1f1f"/>
-          <w:sz w:val="22"/>
-          <w:szCs w:val="22"/>
-        </w:rPr>
-        <w:t xml:space="preserve">Два принципа, которые я проверяю каждый раз, когда решаю, делать ли новую функцию.</w:t>
+        <w:t xml:space="preserve">7.4. Что не поменяется, что бы ни добавлялось</w:t>
+      </w:r>
+    </w:p>
+    <w:p>
+      <w:pPr>
+        <w:spacing w:after="120" w:line="300"/>
+        <w:jc w:val="left"/>
+      </w:pPr>
+      <w:r>
+        <w:rPr>
+          <w:rFonts w:ascii="Arial" w:cs="Arial" w:eastAsia="Arial" w:hAnsi="Arial"/>
+          <w:b w:val="false"/>
+          <w:bCs w:val="false"/>
+          <w:i w:val="false"/>
+          <w:iCs w:val="false"/>
+          <w:color w:val="1f1f1f"/>
+          <w:sz w:val="22"/>
+          <w:szCs w:val="22"/>
+        </w:rPr>
+        <w:t xml:space="preserve">Два принципа, по которым проверяется каждое решение о новой функции.</w:t>
       </w:r>
     </w:p>
     <w:p>
@@ -5356,7 +4925,7 @@
           <w:sz w:val="22"/>
           <w:szCs w:val="22"/>
         </w:rPr>
-        <w:t xml:space="preserve">Мы фиксируем то, что уже происходит. Никаких «заполни форму ещё раз».</w:t>
+        <w:t xml:space="preserve">Maket фиксирует то, что уже происходит. Никаких «заполни форму ещё раз».</w:t>
       </w:r>
     </w:p>
     <w:p>

</xml_diff>

<commit_message>
White paper v1.3: data-not-files thesis, AI, EU servers, rename pain
- Add renaming pain paragraph to Part I.2 (folders multiply, structure dissolves)
- Add "Data, not files" architectural concept to Part III intro
- Add AI integration mention (structured data enables AI tools)
- Add European servers / data security / cross-border transfer paragraph
- Strengthen Part VI.3 folder contrast (data vs live files)

Co-Authored-By: Claude Opus 4.6 <noreply@anthropic.com>
</commit_message>
<xml_diff>
--- a/docs/external/Maket_CP_Whitepaper.docx
+++ b/docs/external/Maket_CP_Whitepaper.docx
@@ -950,6 +950,25 @@
     </w:p>
     <w:p>
       <w:pPr>
+        <w:spacing w:after="120" w:line="300"/>
+        <w:jc w:val="left"/>
+      </w:pPr>
+      <w:r>
+        <w:rPr>
+          <w:rFonts w:ascii="Arial" w:cs="Arial" w:eastAsia="Arial" w:hAnsi="Arial"/>
+          <w:b w:val="false"/>
+          <w:bCs w:val="false"/>
+          <w:i w:val="false"/>
+          <w:iCs w:val="false"/>
+          <w:color w:val="1f1f1f"/>
+          <w:sz w:val="22"/>
+          <w:szCs w:val="22"/>
+        </w:rPr>
+        <w:t xml:space="preserve">И ещё одна боль, которую почти никто не называет вслух: переименование. Когда кадр проходит через несколько этапов, каждый участник переименовывает его по-своему — под свой процесс, под свою папку. К финалу имя файла уже ничего не говорит, а связь с исходником потеряна. В папочной системе это неизбежно: как только папок становится десять, структура размывается. Три срочных кадра вырвали из процесса и двинули вперёд — и папочная структура начинает рассыпаться, потому что она держится на живых файлах, а не на данных о них.</w:t>
+      </w:r>
+    </w:p>
+    <w:p>
+      <w:pPr>
         <w:pStyle w:val="Heading2"/>
         <w:spacing w:after="180" w:before="280"/>
       </w:pPr>
@@ -1840,6 +1859,80 @@
           <w:szCs w:val="22"/>
         </w:rPr>
         <w:t xml:space="preserve">Команде Maket упрощает ровно то, что в обычном проекте съедает больше всего времени: сведение превью, общение с клиентом, пересылки версий, сверки «какая правка принята». Всё, что сейчас делается вручную в чатах и папках, внутри Maket делается один раз — и остаётся в проекте как видимая история.</w:t>
+      </w:r>
+    </w:p>
+    <w:p>
+      <w:pPr>
+        <w:pStyle w:val="Heading3"/>
+        <w:spacing w:after="120" w:before="200"/>
+      </w:pPr>
+      <w:r>
+        <w:rPr>
+          <w:rFonts w:ascii="Arial" w:cs="Arial" w:eastAsia="Arial" w:hAnsi="Arial"/>
+          <w:b/>
+          <w:bCs/>
+          <w:color w:val="111111"/>
+          <w:sz w:val="22"/>
+          <w:szCs w:val="22"/>
+        </w:rPr>
+        <w:t xml:space="preserve">Данные, а не файлы</w:t>
+      </w:r>
+    </w:p>
+    <w:p>
+      <w:pPr>
+        <w:spacing w:after="120" w:line="300"/>
+        <w:jc w:val="left"/>
+      </w:pPr>
+      <w:r>
+        <w:rPr>
+          <w:rFonts w:ascii="Arial" w:cs="Arial" w:eastAsia="Arial" w:hAnsi="Arial"/>
+          <w:b w:val="false"/>
+          <w:bCs w:val="false"/>
+          <w:i w:val="false"/>
+          <w:iCs w:val="false"/>
+          <w:color w:val="1f1f1f"/>
+          <w:sz w:val="22"/>
+          <w:szCs w:val="22"/>
+        </w:rPr>
+        <w:t xml:space="preserve">Ключевое архитектурное решение, на котором стоит продукт: Maket работает с данными о фотографиях, а не с самими файлами как живыми объектами. Папка — живой контейнер: переложил файл, переименовал — потерял структуру. Maket хранит путь каждого кадра целиком, от первого превью до финала. Именно поэтому структура не нарушается, когда из процесса вырывают три срочных кадра и двигают их вперёд — папки начинают множиться и размываться, а данные нет.</w:t>
+      </w:r>
+    </w:p>
+    <w:p>
+      <w:pPr>
+        <w:spacing w:after="120" w:line="300"/>
+        <w:jc w:val="left"/>
+      </w:pPr>
+      <w:r>
+        <w:rPr>
+          <w:rFonts w:ascii="Arial" w:cs="Arial" w:eastAsia="Arial" w:hAnsi="Arial"/>
+          <w:b w:val="false"/>
+          <w:bCs w:val="false"/>
+          <w:i w:val="false"/>
+          <w:iCs w:val="false"/>
+          <w:color w:val="1f1f1f"/>
+          <w:sz w:val="22"/>
+          <w:szCs w:val="22"/>
+        </w:rPr>
+        <w:t xml:space="preserve">Maket знает не просто «фотография существует где-то». Он знает всю историю её существования: когда появилась, кто отобрал, кто одобрил, какие правки получила, в какой контейнер попала. Этот путь Maket передаёт программам, с которыми команда и клиент уже работают — Capture One, Photoshop, CMS клиента. А ещё — ИИ-инструментам: именно потому, что данные структурированы и описаны, ИИ может читать контекст проекта, помогать с категоризацией кадров, сопоставлением артикулов, распознаванием дублей и аналитикой отбраковок.</w:t>
+      </w:r>
+    </w:p>
+    <w:p>
+      <w:pPr>
+        <w:spacing w:after="120" w:line="300"/>
+        <w:jc w:val="left"/>
+      </w:pPr>
+      <w:r>
+        <w:rPr>
+          <w:rFonts w:ascii="Arial" w:cs="Arial" w:eastAsia="Arial" w:hAnsi="Arial"/>
+          <w:b w:val="false"/>
+          <w:bCs w:val="false"/>
+          <w:i w:val="false"/>
+          <w:iCs w:val="false"/>
+          <w:color w:val="1f1f1f"/>
+          <w:sz w:val="22"/>
+          <w:szCs w:val="22"/>
+        </w:rPr>
+        <w:t xml:space="preserve">Все данные хранятся на защищённых европейских серверах. Для брендов, работающих с международными командами, это существенно: трансграничная передача визуального контента проходит через инфраструктуру, соответствующую европейским стандартам защиты данных. Для команды это значит, что файлы клиента не оказываются на непонятном диске — они лежат в контролируемой среде с шифрованием и управлением доступом.</w:t>
       </w:r>
     </w:p>
     <w:p>
@@ -4503,7 +4596,26 @@
           <w:sz w:val="22"/>
           <w:szCs w:val="22"/>
         </w:rPr>
-        <w:t xml:space="preserve">Maket не заменяет облако. Превью лежат в том же Supabase Storage. Maket просто добавляет поверх файлов слой смысла: этап, решение, комментарий, итерация. Файл остаётся файлом, но теперь вокруг него есть контекст.</w:t>
+        <w:t xml:space="preserve">И главное: папочная структура хрупкая. Как только папок становится десять — а в реальном проекте это неизбежно — структура начинает размываться. Вырвали три срочных кадра и двинули вперёд — структура рассыпалась, потому что она держалась на живых файлах, а не на данных. Переименовал — потерял связь с исходником. Переложил — потерял контекст. Maket работает иначе: он оперирует данными и путями, а не живыми фотографиями. Структура не ломается, потому что она существует не в файловой системе, а в базе данных.</w:t>
+      </w:r>
+    </w:p>
+    <w:p>
+      <w:pPr>
+        <w:spacing w:after="120" w:line="300"/>
+        <w:jc w:val="left"/>
+      </w:pPr>
+      <w:r>
+        <w:rPr>
+          <w:rFonts w:ascii="Arial" w:cs="Arial" w:eastAsia="Arial" w:hAnsi="Arial"/>
+          <w:b w:val="false"/>
+          <w:bCs w:val="false"/>
+          <w:i w:val="false"/>
+          <w:iCs w:val="false"/>
+          <w:color w:val="1f1f1f"/>
+          <w:sz w:val="22"/>
+          <w:szCs w:val="22"/>
+        </w:rPr>
+        <w:t xml:space="preserve">Maket не заменяет облако. Превью лежат в том же облачном хранилище. Maket добавляет поверх файлов слой смысла: этап, решение, комментарий, итерация. Файл остаётся файлом, но теперь вокруг него есть контекст — и этот контекст не пропадает, сколько бы раз файл ни переименовали и ни переложили.</w:t>
       </w:r>
     </w:p>
     <w:p>

</xml_diff>